<commit_message>
Retool case study questions and analysis flow
</commit_message>
<xml_diff>
--- a/SOLUTION/Distributor_Case_Study_Report.docx
+++ b/SOLUTION/Distributor_Case_Study_Report.docx
@@ -69,7 +69,7 @@
           <w:color w:val="17365D"/>
           <w:sz w:val="22"/>
         </w:rPr>
-        <w:t>Growth was profitable and customer-level diversification was strong. The next value opportunity is to defend the core segment, improve margin where scale is under-monetized, and prioritize retention by recoverable revenue.</w:t>
+        <w:t>The company has grown while improving gross profit and margin. The next priorities are to protect the largest customer segment, improve weaker margins in other large segments, and focus outreach on recently valuable inactive customers.</w:t>
       </w:r>
     </w:p>
     <w:p>
@@ -111,7 +111,7 @@
           <w:color w:val="20384A"/>
           <w:sz w:val="22"/>
         </w:rPr>
-        <w:t>The company’s 2018-2024 growth was profitable and broadly diversified across individual customers. Recognized revenue increased every year, gross profit grew faster, and gross margin expanded. The main strategic exposures are concentrated at the customer-segment level and in a sizable dormant-account pool.</w:t>
+        <w:t>The company has a healthy financial history. Revenue increased every year from 2018 through 2024, gross profit grew faster than revenue, and gross margin improved. The company is not dependent on a few individual customers, but it does depend heavily on the Independent Retail segment.</w:t>
       </w:r>
     </w:p>
     <w:tbl>
@@ -161,7 +161,7 @@
                 <w:color w:val="17365D"/>
                 <w:sz w:val="18"/>
               </w:rPr>
-              <w:t>Validated measure</w:t>
+              <w:t>Final measure</w:t>
             </w:r>
           </w:p>
         </w:tc>
@@ -669,7 +669,7 @@
                 <w:color w:val="20384A"/>
                 <w:sz w:val="18"/>
               </w:rPr>
-              <w:t>Protect Independent Retail while expanding high-margin segments</w:t>
+              <w:t>Protect Independent Retail and test smaller high-margin segments</w:t>
             </w:r>
           </w:p>
         </w:tc>
@@ -694,7 +694,7 @@
                 <w:color w:val="20384A"/>
                 <w:sz w:val="18"/>
               </w:rPr>
-              <w:t>Defend the main profit pool and improve diversification</w:t>
+              <w:t>Protect the largest source of profit and add other sources of growth</w:t>
             </w:r>
           </w:p>
         </w:tc>
@@ -746,7 +746,7 @@
                 <w:color w:val="20384A"/>
                 <w:sz w:val="18"/>
               </w:rPr>
-              <w:t>Launch a monthly value-based retention queue</w:t>
+              <w:t>Contact recent, high-value inactive customers first</w:t>
             </w:r>
           </w:p>
         </w:tc>
@@ -771,7 +771,7 @@
                 <w:color w:val="20384A"/>
                 <w:sz w:val="18"/>
               </w:rPr>
-              <w:t>Prioritize recent, high-value risk and measure reactivation</w:t>
+              <w:t>Use sales time on customers with the clearest recent value</w:t>
             </w:r>
           </w:p>
         </w:tc>
@@ -823,7 +823,7 @@
                 <w:color w:val="20384A"/>
                 <w:sz w:val="18"/>
               </w:rPr>
-              <w:t>Review pricing and cost-to-serve in margin-light segments</w:t>
+              <w:t>Review margins in large segments such as Wholesale Trade</w:t>
             </w:r>
           </w:p>
         </w:tc>
@@ -848,7 +848,7 @@
                 <w:color w:val="20384A"/>
                 <w:sz w:val="18"/>
               </w:rPr>
-              <w:t>Convert existing scale into incremental gross profit</w:t>
+              <w:t>Add gross profit from business the company already has</w:t>
             </w:r>
           </w:p>
         </w:tc>
@@ -878,7 +878,7 @@
         <w:keepNext/>
       </w:pPr>
       <w:r>
-        <w:t>1. Revenue and Margin Trends</w:t>
+        <w:t>1. Customer Segment Profitability</w:t>
       </w:r>
     </w:p>
     <w:p>
@@ -897,1198 +897,7 @@
           <w:color w:val="17365D"/>
           <w:sz w:val="22"/>
         </w:rPr>
-        <w:t>Recognized revenue rose every year, and gross profit grew faster than revenue.</w:t>
-      </w:r>
-    </w:p>
-    <w:p>
-      <w:pPr>
-        <w:keepNext/>
-        <w:spacing w:before="40" w:after="40"/>
-        <w:jc w:val="center"/>
-      </w:pPr>
-      <w:r>
-        <w:drawing>
-          <wp:inline xmlns:a="http://schemas.openxmlformats.org/drawingml/2006/main" xmlns:pic="http://schemas.openxmlformats.org/drawingml/2006/picture">
-            <wp:extent cx="5897880" cy="3317558"/>
-            <wp:docPr id="1" name="Picture 1" descr="Stacked annual revenue bars show cost and gross profit from 2018 through 2024, with an accompanying gross-margin line rising from 19.15 percent to 22.01 percent." title="Stacked annual revenue bars show cost and gross profit from 2018 through 2024, with an accompanying gross-margin line rising from 19.15 percent to 22.01 percent."/>
-            <wp:cNvGraphicFramePr>
-              <a:graphicFrameLocks noChangeAspect="1"/>
-            </wp:cNvGraphicFramePr>
-            <a:graphic>
-              <a:graphicData uri="http://schemas.openxmlformats.org/drawingml/2006/picture">
-                <pic:pic>
-                  <pic:nvPicPr>
-                    <pic:cNvPr id="0" name="01_revenue_margin_trends.png"/>
-                    <pic:cNvPicPr/>
-                  </pic:nvPicPr>
-                  <pic:blipFill>
-                    <a:blip r:embed="rId11"/>
-                    <a:stretch>
-                      <a:fillRect/>
-                    </a:stretch>
-                  </pic:blipFill>
-                  <pic:spPr>
-                    <a:xfrm>
-                      <a:off x="0" y="0"/>
-                      <a:ext cx="5897880" cy="3317558"/>
-                    </a:xfrm>
-                    <a:prstGeom prst="rect"/>
-                  </pic:spPr>
-                </pic:pic>
-              </a:graphicData>
-            </a:graphic>
-          </wp:inline>
-        </w:drawing>
-      </w:r>
-    </w:p>
-    <w:p>
-      <w:pPr>
-        <w:pStyle w:val="Caption"/>
-        <w:spacing w:before="40" w:after="160"/>
-        <w:jc w:val="center"/>
-      </w:pPr>
-      <w:r>
-        <w:rPr>
-          <w:rFonts w:ascii="Calibri" w:hAnsi="Calibri"/>
-          <w:i/>
-          <w:color w:val="607184"/>
-          <w:sz w:val="18"/>
-        </w:rPr>
-        <w:t>Figure 1. Annual recognized revenue composition and gross-margin trend.</w:t>
-      </w:r>
-    </w:p>
-    <w:tbl>
-      <w:tblPr>
-        <w:tblW w:type="dxa" w:w="9360"/>
-        <w:tblLayout w:type="fixed"/>
-        <w:tblLook w:firstColumn="1" w:firstRow="1" w:lastColumn="0" w:lastRow="0" w:noHBand="0" w:noVBand="1" w:val="04A0"/>
-        <w:jc w:val="left"/>
-        <w:tblInd w:w="120" w:type="dxa"/>
-        <w:tblBorders>
-          <w:top w:val="single" w:sz="4" w:color="D9E0E7"/>
-          <w:left w:val="single" w:sz="4" w:color="D9E0E7"/>
-          <w:bottom w:val="single" w:sz="4" w:color="D9E0E7"/>
-          <w:right w:val="single" w:sz="4" w:color="D9E0E7"/>
-          <w:insideH w:val="single" w:sz="4" w:color="D9E0E7"/>
-          <w:insideV w:val="single" w:sz="4" w:color="D9E0E7"/>
-        </w:tblBorders>
-      </w:tblPr>
-      <w:tblGrid>
-        <w:gridCol w:w="900"/>
-        <w:gridCol w:w="2200"/>
-        <w:gridCol w:w="2200"/>
-        <w:gridCol w:w="1800"/>
-        <w:gridCol w:w="2260"/>
-      </w:tblGrid>
-      <w:tr>
-        <w:trPr>
-          <w:tblHeader w:val="true"/>
-        </w:trPr>
-        <w:tc>
-          <w:tcPr>
-            <w:tcW w:type="dxa" w:w="900"/>
-            <w:tcMar>
-              <w:top w:w="80" w:type="dxa"/>
-              <w:start w:w="120" w:type="dxa"/>
-              <w:bottom w:w="80" w:type="dxa"/>
-              <w:end w:w="120" w:type="dxa"/>
-            </w:tcMar>
-            <w:shd w:fill="F2F4F7"/>
-            <w:vAlign w:val="center"/>
-          </w:tcPr>
-          <w:p>
-            <w:pPr>
-              <w:spacing w:after="0"/>
-            </w:pPr>
-            <w:r>
-              <w:rPr>
-                <w:rFonts w:ascii="Calibri" w:hAnsi="Calibri"/>
-                <w:b/>
-                <w:color w:val="17365D"/>
-                <w:sz w:val="18"/>
-              </w:rPr>
-              <w:t>Year</w:t>
-            </w:r>
-          </w:p>
-        </w:tc>
-        <w:tc>
-          <w:tcPr>
-            <w:tcW w:type="dxa" w:w="2200"/>
-            <w:tcMar>
-              <w:top w:w="80" w:type="dxa"/>
-              <w:start w:w="120" w:type="dxa"/>
-              <w:bottom w:w="80" w:type="dxa"/>
-              <w:end w:w="120" w:type="dxa"/>
-            </w:tcMar>
-            <w:shd w:fill="F2F4F7"/>
-            <w:vAlign w:val="center"/>
-          </w:tcPr>
-          <w:p>
-            <w:pPr>
-              <w:spacing w:after="0"/>
-            </w:pPr>
-            <w:r>
-              <w:rPr>
-                <w:rFonts w:ascii="Calibri" w:hAnsi="Calibri"/>
-                <w:b/>
-                <w:color w:val="17365D"/>
-                <w:sz w:val="18"/>
-              </w:rPr>
-              <w:t>Revenue</w:t>
-            </w:r>
-          </w:p>
-        </w:tc>
-        <w:tc>
-          <w:tcPr>
-            <w:tcW w:type="dxa" w:w="2200"/>
-            <w:tcMar>
-              <w:top w:w="80" w:type="dxa"/>
-              <w:start w:w="120" w:type="dxa"/>
-              <w:bottom w:w="80" w:type="dxa"/>
-              <w:end w:w="120" w:type="dxa"/>
-            </w:tcMar>
-            <w:shd w:fill="F2F4F7"/>
-            <w:vAlign w:val="center"/>
-          </w:tcPr>
-          <w:p>
-            <w:pPr>
-              <w:spacing w:after="0"/>
-            </w:pPr>
-            <w:r>
-              <w:rPr>
-                <w:rFonts w:ascii="Calibri" w:hAnsi="Calibri"/>
-                <w:b/>
-                <w:color w:val="17365D"/>
-                <w:sz w:val="18"/>
-              </w:rPr>
-              <w:t>Gross profit</w:t>
-            </w:r>
-          </w:p>
-        </w:tc>
-        <w:tc>
-          <w:tcPr>
-            <w:tcW w:type="dxa" w:w="1800"/>
-            <w:tcMar>
-              <w:top w:w="80" w:type="dxa"/>
-              <w:start w:w="120" w:type="dxa"/>
-              <w:bottom w:w="80" w:type="dxa"/>
-              <w:end w:w="120" w:type="dxa"/>
-            </w:tcMar>
-            <w:shd w:fill="F2F4F7"/>
-            <w:vAlign w:val="center"/>
-          </w:tcPr>
-          <w:p>
-            <w:pPr>
-              <w:spacing w:after="0"/>
-            </w:pPr>
-            <w:r>
-              <w:rPr>
-                <w:rFonts w:ascii="Calibri" w:hAnsi="Calibri"/>
-                <w:b/>
-                <w:color w:val="17365D"/>
-                <w:sz w:val="18"/>
-              </w:rPr>
-              <w:t>Margin</w:t>
-            </w:r>
-          </w:p>
-        </w:tc>
-        <w:tc>
-          <w:tcPr>
-            <w:tcW w:type="dxa" w:w="2260"/>
-            <w:tcMar>
-              <w:top w:w="80" w:type="dxa"/>
-              <w:start w:w="120" w:type="dxa"/>
-              <w:bottom w:w="80" w:type="dxa"/>
-              <w:end w:w="120" w:type="dxa"/>
-            </w:tcMar>
-            <w:shd w:fill="F2F4F7"/>
-            <w:vAlign w:val="center"/>
-          </w:tcPr>
-          <w:p>
-            <w:pPr>
-              <w:spacing w:after="0"/>
-            </w:pPr>
-            <w:r>
-              <w:rPr>
-                <w:rFonts w:ascii="Calibri" w:hAnsi="Calibri"/>
-                <w:b/>
-                <w:color w:val="17365D"/>
-                <w:sz w:val="18"/>
-              </w:rPr>
-              <w:t>Revenue YoY</w:t>
-            </w:r>
-          </w:p>
-        </w:tc>
-      </w:tr>
-      <w:tr>
-        <w:tc>
-          <w:tcPr>
-            <w:tcW w:type="dxa" w:w="900"/>
-            <w:vAlign w:val="center"/>
-            <w:tcMar>
-              <w:top w:w="80" w:type="dxa"/>
-              <w:start w:w="120" w:type="dxa"/>
-              <w:bottom w:w="80" w:type="dxa"/>
-              <w:end w:w="120" w:type="dxa"/>
-            </w:tcMar>
-          </w:tcPr>
-          <w:p>
-            <w:pPr>
-              <w:spacing w:after="0"/>
-              <w:jc w:val="center"/>
-            </w:pPr>
-            <w:r>
-              <w:rPr>
-                <w:rFonts w:ascii="Calibri" w:hAnsi="Calibri"/>
-                <w:color w:val="20384A"/>
-                <w:sz w:val="18"/>
-              </w:rPr>
-              <w:t>2018</w:t>
-            </w:r>
-          </w:p>
-        </w:tc>
-        <w:tc>
-          <w:tcPr>
-            <w:tcW w:type="dxa" w:w="2200"/>
-            <w:vAlign w:val="center"/>
-            <w:tcMar>
-              <w:top w:w="80" w:type="dxa"/>
-              <w:start w:w="120" w:type="dxa"/>
-              <w:bottom w:w="80" w:type="dxa"/>
-              <w:end w:w="120" w:type="dxa"/>
-            </w:tcMar>
-          </w:tcPr>
-          <w:p>
-            <w:pPr>
-              <w:spacing w:after="0"/>
-              <w:jc w:val="right"/>
-            </w:pPr>
-            <w:r>
-              <w:rPr>
-                <w:rFonts w:ascii="Calibri" w:hAnsi="Calibri"/>
-                <w:color w:val="20384A"/>
-                <w:sz w:val="18"/>
-              </w:rPr>
-              <w:t>$79.4M</w:t>
-            </w:r>
-          </w:p>
-        </w:tc>
-        <w:tc>
-          <w:tcPr>
-            <w:tcW w:type="dxa" w:w="2200"/>
-            <w:vAlign w:val="center"/>
-            <w:tcMar>
-              <w:top w:w="80" w:type="dxa"/>
-              <w:start w:w="120" w:type="dxa"/>
-              <w:bottom w:w="80" w:type="dxa"/>
-              <w:end w:w="120" w:type="dxa"/>
-            </w:tcMar>
-          </w:tcPr>
-          <w:p>
-            <w:pPr>
-              <w:spacing w:after="0"/>
-              <w:jc w:val="right"/>
-            </w:pPr>
-            <w:r>
-              <w:rPr>
-                <w:rFonts w:ascii="Calibri" w:hAnsi="Calibri"/>
-                <w:color w:val="20384A"/>
-                <w:sz w:val="18"/>
-              </w:rPr>
-              <w:t>$15.2M</w:t>
-            </w:r>
-          </w:p>
-        </w:tc>
-        <w:tc>
-          <w:tcPr>
-            <w:tcW w:type="dxa" w:w="1800"/>
-            <w:vAlign w:val="center"/>
-            <w:tcMar>
-              <w:top w:w="80" w:type="dxa"/>
-              <w:start w:w="120" w:type="dxa"/>
-              <w:bottom w:w="80" w:type="dxa"/>
-              <w:end w:w="120" w:type="dxa"/>
-            </w:tcMar>
-          </w:tcPr>
-          <w:p>
-            <w:pPr>
-              <w:spacing w:after="0"/>
-              <w:jc w:val="right"/>
-            </w:pPr>
-            <w:r>
-              <w:rPr>
-                <w:rFonts w:ascii="Calibri" w:hAnsi="Calibri"/>
-                <w:color w:val="20384A"/>
-                <w:sz w:val="18"/>
-              </w:rPr>
-              <w:t>19.15%</w:t>
-            </w:r>
-          </w:p>
-        </w:tc>
-        <w:tc>
-          <w:tcPr>
-            <w:tcW w:type="dxa" w:w="2260"/>
-            <w:vAlign w:val="center"/>
-            <w:tcMar>
-              <w:top w:w="80" w:type="dxa"/>
-              <w:start w:w="120" w:type="dxa"/>
-              <w:bottom w:w="80" w:type="dxa"/>
-              <w:end w:w="120" w:type="dxa"/>
-            </w:tcMar>
-          </w:tcPr>
-          <w:p>
-            <w:pPr>
-              <w:spacing w:after="0"/>
-              <w:jc w:val="right"/>
-            </w:pPr>
-            <w:r>
-              <w:rPr>
-                <w:rFonts w:ascii="Calibri" w:hAnsi="Calibri"/>
-                <w:color w:val="20384A"/>
-                <w:sz w:val="18"/>
-              </w:rPr>
-              <w:t>-</w:t>
-            </w:r>
-          </w:p>
-        </w:tc>
-      </w:tr>
-      <w:tr>
-        <w:tc>
-          <w:tcPr>
-            <w:tcW w:type="dxa" w:w="900"/>
-            <w:vAlign w:val="center"/>
-            <w:tcMar>
-              <w:top w:w="80" w:type="dxa"/>
-              <w:start w:w="120" w:type="dxa"/>
-              <w:bottom w:w="80" w:type="dxa"/>
-              <w:end w:w="120" w:type="dxa"/>
-            </w:tcMar>
-          </w:tcPr>
-          <w:p>
-            <w:pPr>
-              <w:spacing w:after="0"/>
-              <w:jc w:val="center"/>
-            </w:pPr>
-            <w:r>
-              <w:rPr>
-                <w:rFonts w:ascii="Calibri" w:hAnsi="Calibri"/>
-                <w:color w:val="20384A"/>
-                <w:sz w:val="18"/>
-              </w:rPr>
-              <w:t>2019</w:t>
-            </w:r>
-          </w:p>
-        </w:tc>
-        <w:tc>
-          <w:tcPr>
-            <w:tcW w:type="dxa" w:w="2200"/>
-            <w:vAlign w:val="center"/>
-            <w:tcMar>
-              <w:top w:w="80" w:type="dxa"/>
-              <w:start w:w="120" w:type="dxa"/>
-              <w:bottom w:w="80" w:type="dxa"/>
-              <w:end w:w="120" w:type="dxa"/>
-            </w:tcMar>
-          </w:tcPr>
-          <w:p>
-            <w:pPr>
-              <w:spacing w:after="0"/>
-              <w:jc w:val="right"/>
-            </w:pPr>
-            <w:r>
-              <w:rPr>
-                <w:rFonts w:ascii="Calibri" w:hAnsi="Calibri"/>
-                <w:color w:val="20384A"/>
-                <w:sz w:val="18"/>
-              </w:rPr>
-              <w:t>$82.9M</w:t>
-            </w:r>
-          </w:p>
-        </w:tc>
-        <w:tc>
-          <w:tcPr>
-            <w:tcW w:type="dxa" w:w="2200"/>
-            <w:vAlign w:val="center"/>
-            <w:tcMar>
-              <w:top w:w="80" w:type="dxa"/>
-              <w:start w:w="120" w:type="dxa"/>
-              <w:bottom w:w="80" w:type="dxa"/>
-              <w:end w:w="120" w:type="dxa"/>
-            </w:tcMar>
-          </w:tcPr>
-          <w:p>
-            <w:pPr>
-              <w:spacing w:after="0"/>
-              <w:jc w:val="right"/>
-            </w:pPr>
-            <w:r>
-              <w:rPr>
-                <w:rFonts w:ascii="Calibri" w:hAnsi="Calibri"/>
-                <w:color w:val="20384A"/>
-                <w:sz w:val="18"/>
-              </w:rPr>
-              <w:t>$17.0M</w:t>
-            </w:r>
-          </w:p>
-        </w:tc>
-        <w:tc>
-          <w:tcPr>
-            <w:tcW w:type="dxa" w:w="1800"/>
-            <w:vAlign w:val="center"/>
-            <w:tcMar>
-              <w:top w:w="80" w:type="dxa"/>
-              <w:start w:w="120" w:type="dxa"/>
-              <w:bottom w:w="80" w:type="dxa"/>
-              <w:end w:w="120" w:type="dxa"/>
-            </w:tcMar>
-          </w:tcPr>
-          <w:p>
-            <w:pPr>
-              <w:spacing w:after="0"/>
-              <w:jc w:val="right"/>
-            </w:pPr>
-            <w:r>
-              <w:rPr>
-                <w:rFonts w:ascii="Calibri" w:hAnsi="Calibri"/>
-                <w:color w:val="20384A"/>
-                <w:sz w:val="18"/>
-              </w:rPr>
-              <w:t>20.47%</w:t>
-            </w:r>
-          </w:p>
-        </w:tc>
-        <w:tc>
-          <w:tcPr>
-            <w:tcW w:type="dxa" w:w="2260"/>
-            <w:vAlign w:val="center"/>
-            <w:tcMar>
-              <w:top w:w="80" w:type="dxa"/>
-              <w:start w:w="120" w:type="dxa"/>
-              <w:bottom w:w="80" w:type="dxa"/>
-              <w:end w:w="120" w:type="dxa"/>
-            </w:tcMar>
-          </w:tcPr>
-          <w:p>
-            <w:pPr>
-              <w:spacing w:after="0"/>
-              <w:jc w:val="right"/>
-            </w:pPr>
-            <w:r>
-              <w:rPr>
-                <w:rFonts w:ascii="Calibri" w:hAnsi="Calibri"/>
-                <w:color w:val="20384A"/>
-                <w:sz w:val="18"/>
-              </w:rPr>
-              <w:t>4.49%</w:t>
-            </w:r>
-          </w:p>
-        </w:tc>
-      </w:tr>
-      <w:tr>
-        <w:tc>
-          <w:tcPr>
-            <w:tcW w:type="dxa" w:w="900"/>
-            <w:vAlign w:val="center"/>
-            <w:tcMar>
-              <w:top w:w="80" w:type="dxa"/>
-              <w:start w:w="120" w:type="dxa"/>
-              <w:bottom w:w="80" w:type="dxa"/>
-              <w:end w:w="120" w:type="dxa"/>
-            </w:tcMar>
-          </w:tcPr>
-          <w:p>
-            <w:pPr>
-              <w:spacing w:after="0"/>
-              <w:jc w:val="center"/>
-            </w:pPr>
-            <w:r>
-              <w:rPr>
-                <w:rFonts w:ascii="Calibri" w:hAnsi="Calibri"/>
-                <w:color w:val="20384A"/>
-                <w:sz w:val="18"/>
-              </w:rPr>
-              <w:t>2020</w:t>
-            </w:r>
-          </w:p>
-        </w:tc>
-        <w:tc>
-          <w:tcPr>
-            <w:tcW w:type="dxa" w:w="2200"/>
-            <w:vAlign w:val="center"/>
-            <w:tcMar>
-              <w:top w:w="80" w:type="dxa"/>
-              <w:start w:w="120" w:type="dxa"/>
-              <w:bottom w:w="80" w:type="dxa"/>
-              <w:end w:w="120" w:type="dxa"/>
-            </w:tcMar>
-          </w:tcPr>
-          <w:p>
-            <w:pPr>
-              <w:spacing w:after="0"/>
-              <w:jc w:val="right"/>
-            </w:pPr>
-            <w:r>
-              <w:rPr>
-                <w:rFonts w:ascii="Calibri" w:hAnsi="Calibri"/>
-                <w:color w:val="20384A"/>
-                <w:sz w:val="18"/>
-              </w:rPr>
-              <w:t>$88.3M</w:t>
-            </w:r>
-          </w:p>
-        </w:tc>
-        <w:tc>
-          <w:tcPr>
-            <w:tcW w:type="dxa" w:w="2200"/>
-            <w:vAlign w:val="center"/>
-            <w:tcMar>
-              <w:top w:w="80" w:type="dxa"/>
-              <w:start w:w="120" w:type="dxa"/>
-              <w:bottom w:w="80" w:type="dxa"/>
-              <w:end w:w="120" w:type="dxa"/>
-            </w:tcMar>
-          </w:tcPr>
-          <w:p>
-            <w:pPr>
-              <w:spacing w:after="0"/>
-              <w:jc w:val="right"/>
-            </w:pPr>
-            <w:r>
-              <w:rPr>
-                <w:rFonts w:ascii="Calibri" w:hAnsi="Calibri"/>
-                <w:color w:val="20384A"/>
-                <w:sz w:val="18"/>
-              </w:rPr>
-              <w:t>$18.9M</w:t>
-            </w:r>
-          </w:p>
-        </w:tc>
-        <w:tc>
-          <w:tcPr>
-            <w:tcW w:type="dxa" w:w="1800"/>
-            <w:vAlign w:val="center"/>
-            <w:tcMar>
-              <w:top w:w="80" w:type="dxa"/>
-              <w:start w:w="120" w:type="dxa"/>
-              <w:bottom w:w="80" w:type="dxa"/>
-              <w:end w:w="120" w:type="dxa"/>
-            </w:tcMar>
-          </w:tcPr>
-          <w:p>
-            <w:pPr>
-              <w:spacing w:after="0"/>
-              <w:jc w:val="right"/>
-            </w:pPr>
-            <w:r>
-              <w:rPr>
-                <w:rFonts w:ascii="Calibri" w:hAnsi="Calibri"/>
-                <w:color w:val="20384A"/>
-                <w:sz w:val="18"/>
-              </w:rPr>
-              <w:t>21.43%</w:t>
-            </w:r>
-          </w:p>
-        </w:tc>
-        <w:tc>
-          <w:tcPr>
-            <w:tcW w:type="dxa" w:w="2260"/>
-            <w:vAlign w:val="center"/>
-            <w:tcMar>
-              <w:top w:w="80" w:type="dxa"/>
-              <w:start w:w="120" w:type="dxa"/>
-              <w:bottom w:w="80" w:type="dxa"/>
-              <w:end w:w="120" w:type="dxa"/>
-            </w:tcMar>
-          </w:tcPr>
-          <w:p>
-            <w:pPr>
-              <w:spacing w:after="0"/>
-              <w:jc w:val="right"/>
-            </w:pPr>
-            <w:r>
-              <w:rPr>
-                <w:rFonts w:ascii="Calibri" w:hAnsi="Calibri"/>
-                <w:color w:val="20384A"/>
-                <w:sz w:val="18"/>
-              </w:rPr>
-              <w:t>6.44%</w:t>
-            </w:r>
-          </w:p>
-        </w:tc>
-      </w:tr>
-      <w:tr>
-        <w:tc>
-          <w:tcPr>
-            <w:tcW w:type="dxa" w:w="900"/>
-            <w:vAlign w:val="center"/>
-            <w:tcMar>
-              <w:top w:w="80" w:type="dxa"/>
-              <w:start w:w="120" w:type="dxa"/>
-              <w:bottom w:w="80" w:type="dxa"/>
-              <w:end w:w="120" w:type="dxa"/>
-            </w:tcMar>
-          </w:tcPr>
-          <w:p>
-            <w:pPr>
-              <w:spacing w:after="0"/>
-              <w:jc w:val="center"/>
-            </w:pPr>
-            <w:r>
-              <w:rPr>
-                <w:rFonts w:ascii="Calibri" w:hAnsi="Calibri"/>
-                <w:color w:val="20384A"/>
-                <w:sz w:val="18"/>
-              </w:rPr>
-              <w:t>2021</w:t>
-            </w:r>
-          </w:p>
-        </w:tc>
-        <w:tc>
-          <w:tcPr>
-            <w:tcW w:type="dxa" w:w="2200"/>
-            <w:vAlign w:val="center"/>
-            <w:tcMar>
-              <w:top w:w="80" w:type="dxa"/>
-              <w:start w:w="120" w:type="dxa"/>
-              <w:bottom w:w="80" w:type="dxa"/>
-              <w:end w:w="120" w:type="dxa"/>
-            </w:tcMar>
-          </w:tcPr>
-          <w:p>
-            <w:pPr>
-              <w:spacing w:after="0"/>
-              <w:jc w:val="right"/>
-            </w:pPr>
-            <w:r>
-              <w:rPr>
-                <w:rFonts w:ascii="Calibri" w:hAnsi="Calibri"/>
-                <w:color w:val="20384A"/>
-                <w:sz w:val="18"/>
-              </w:rPr>
-              <w:t>$103.0M</w:t>
-            </w:r>
-          </w:p>
-        </w:tc>
-        <w:tc>
-          <w:tcPr>
-            <w:tcW w:type="dxa" w:w="2200"/>
-            <w:vAlign w:val="center"/>
-            <w:tcMar>
-              <w:top w:w="80" w:type="dxa"/>
-              <w:start w:w="120" w:type="dxa"/>
-              <w:bottom w:w="80" w:type="dxa"/>
-              <w:end w:w="120" w:type="dxa"/>
-            </w:tcMar>
-          </w:tcPr>
-          <w:p>
-            <w:pPr>
-              <w:spacing w:after="0"/>
-              <w:jc w:val="right"/>
-            </w:pPr>
-            <w:r>
-              <w:rPr>
-                <w:rFonts w:ascii="Calibri" w:hAnsi="Calibri"/>
-                <w:color w:val="20384A"/>
-                <w:sz w:val="18"/>
-              </w:rPr>
-              <w:t>$22.0M</w:t>
-            </w:r>
-          </w:p>
-        </w:tc>
-        <w:tc>
-          <w:tcPr>
-            <w:tcW w:type="dxa" w:w="1800"/>
-            <w:vAlign w:val="center"/>
-            <w:tcMar>
-              <w:top w:w="80" w:type="dxa"/>
-              <w:start w:w="120" w:type="dxa"/>
-              <w:bottom w:w="80" w:type="dxa"/>
-              <w:end w:w="120" w:type="dxa"/>
-            </w:tcMar>
-          </w:tcPr>
-          <w:p>
-            <w:pPr>
-              <w:spacing w:after="0"/>
-              <w:jc w:val="right"/>
-            </w:pPr>
-            <w:r>
-              <w:rPr>
-                <w:rFonts w:ascii="Calibri" w:hAnsi="Calibri"/>
-                <w:color w:val="20384A"/>
-                <w:sz w:val="18"/>
-              </w:rPr>
-              <w:t>21.39%</w:t>
-            </w:r>
-          </w:p>
-        </w:tc>
-        <w:tc>
-          <w:tcPr>
-            <w:tcW w:type="dxa" w:w="2260"/>
-            <w:vAlign w:val="center"/>
-            <w:tcMar>
-              <w:top w:w="80" w:type="dxa"/>
-              <w:start w:w="120" w:type="dxa"/>
-              <w:bottom w:w="80" w:type="dxa"/>
-              <w:end w:w="120" w:type="dxa"/>
-            </w:tcMar>
-          </w:tcPr>
-          <w:p>
-            <w:pPr>
-              <w:spacing w:after="0"/>
-              <w:jc w:val="right"/>
-            </w:pPr>
-            <w:r>
-              <w:rPr>
-                <w:rFonts w:ascii="Calibri" w:hAnsi="Calibri"/>
-                <w:color w:val="20384A"/>
-                <w:sz w:val="18"/>
-              </w:rPr>
-              <w:t>16.65%</w:t>
-            </w:r>
-          </w:p>
-        </w:tc>
-      </w:tr>
-      <w:tr>
-        <w:tc>
-          <w:tcPr>
-            <w:tcW w:type="dxa" w:w="900"/>
-            <w:vAlign w:val="center"/>
-            <w:tcMar>
-              <w:top w:w="80" w:type="dxa"/>
-              <w:start w:w="120" w:type="dxa"/>
-              <w:bottom w:w="80" w:type="dxa"/>
-              <w:end w:w="120" w:type="dxa"/>
-            </w:tcMar>
-          </w:tcPr>
-          <w:p>
-            <w:pPr>
-              <w:spacing w:after="0"/>
-              <w:jc w:val="center"/>
-            </w:pPr>
-            <w:r>
-              <w:rPr>
-                <w:rFonts w:ascii="Calibri" w:hAnsi="Calibri"/>
-                <w:color w:val="20384A"/>
-                <w:sz w:val="18"/>
-              </w:rPr>
-              <w:t>2022</w:t>
-            </w:r>
-          </w:p>
-        </w:tc>
-        <w:tc>
-          <w:tcPr>
-            <w:tcW w:type="dxa" w:w="2200"/>
-            <w:vAlign w:val="center"/>
-            <w:tcMar>
-              <w:top w:w="80" w:type="dxa"/>
-              <w:start w:w="120" w:type="dxa"/>
-              <w:bottom w:w="80" w:type="dxa"/>
-              <w:end w:w="120" w:type="dxa"/>
-            </w:tcMar>
-          </w:tcPr>
-          <w:p>
-            <w:pPr>
-              <w:spacing w:after="0"/>
-              <w:jc w:val="right"/>
-            </w:pPr>
-            <w:r>
-              <w:rPr>
-                <w:rFonts w:ascii="Calibri" w:hAnsi="Calibri"/>
-                <w:color w:val="20384A"/>
-                <w:sz w:val="18"/>
-              </w:rPr>
-              <w:t>$116.4M</w:t>
-            </w:r>
-          </w:p>
-        </w:tc>
-        <w:tc>
-          <w:tcPr>
-            <w:tcW w:type="dxa" w:w="2200"/>
-            <w:vAlign w:val="center"/>
-            <w:tcMar>
-              <w:top w:w="80" w:type="dxa"/>
-              <w:start w:w="120" w:type="dxa"/>
-              <w:bottom w:w="80" w:type="dxa"/>
-              <w:end w:w="120" w:type="dxa"/>
-            </w:tcMar>
-          </w:tcPr>
-          <w:p>
-            <w:pPr>
-              <w:spacing w:after="0"/>
-              <w:jc w:val="right"/>
-            </w:pPr>
-            <w:r>
-              <w:rPr>
-                <w:rFonts w:ascii="Calibri" w:hAnsi="Calibri"/>
-                <w:color w:val="20384A"/>
-                <w:sz w:val="18"/>
-              </w:rPr>
-              <w:t>$25.1M</w:t>
-            </w:r>
-          </w:p>
-        </w:tc>
-        <w:tc>
-          <w:tcPr>
-            <w:tcW w:type="dxa" w:w="1800"/>
-            <w:vAlign w:val="center"/>
-            <w:tcMar>
-              <w:top w:w="80" w:type="dxa"/>
-              <w:start w:w="120" w:type="dxa"/>
-              <w:bottom w:w="80" w:type="dxa"/>
-              <w:end w:w="120" w:type="dxa"/>
-            </w:tcMar>
-          </w:tcPr>
-          <w:p>
-            <w:pPr>
-              <w:spacing w:after="0"/>
-              <w:jc w:val="right"/>
-            </w:pPr>
-            <w:r>
-              <w:rPr>
-                <w:rFonts w:ascii="Calibri" w:hAnsi="Calibri"/>
-                <w:color w:val="20384A"/>
-                <w:sz w:val="18"/>
-              </w:rPr>
-              <w:t>21.56%</w:t>
-            </w:r>
-          </w:p>
-        </w:tc>
-        <w:tc>
-          <w:tcPr>
-            <w:tcW w:type="dxa" w:w="2260"/>
-            <w:vAlign w:val="center"/>
-            <w:tcMar>
-              <w:top w:w="80" w:type="dxa"/>
-              <w:start w:w="120" w:type="dxa"/>
-              <w:bottom w:w="80" w:type="dxa"/>
-              <w:end w:w="120" w:type="dxa"/>
-            </w:tcMar>
-          </w:tcPr>
-          <w:p>
-            <w:pPr>
-              <w:spacing w:after="0"/>
-              <w:jc w:val="right"/>
-            </w:pPr>
-            <w:r>
-              <w:rPr>
-                <w:rFonts w:ascii="Calibri" w:hAnsi="Calibri"/>
-                <w:color w:val="20384A"/>
-                <w:sz w:val="18"/>
-              </w:rPr>
-              <w:t>12.99%</w:t>
-            </w:r>
-          </w:p>
-        </w:tc>
-      </w:tr>
-      <w:tr>
-        <w:tc>
-          <w:tcPr>
-            <w:tcW w:type="dxa" w:w="900"/>
-            <w:vAlign w:val="center"/>
-            <w:tcMar>
-              <w:top w:w="80" w:type="dxa"/>
-              <w:start w:w="120" w:type="dxa"/>
-              <w:bottom w:w="80" w:type="dxa"/>
-              <w:end w:w="120" w:type="dxa"/>
-            </w:tcMar>
-          </w:tcPr>
-          <w:p>
-            <w:pPr>
-              <w:spacing w:after="0"/>
-              <w:jc w:val="center"/>
-            </w:pPr>
-            <w:r>
-              <w:rPr>
-                <w:rFonts w:ascii="Calibri" w:hAnsi="Calibri"/>
-                <w:color w:val="20384A"/>
-                <w:sz w:val="18"/>
-              </w:rPr>
-              <w:t>2023</w:t>
-            </w:r>
-          </w:p>
-        </w:tc>
-        <w:tc>
-          <w:tcPr>
-            <w:tcW w:type="dxa" w:w="2200"/>
-            <w:vAlign w:val="center"/>
-            <w:tcMar>
-              <w:top w:w="80" w:type="dxa"/>
-              <w:start w:w="120" w:type="dxa"/>
-              <w:bottom w:w="80" w:type="dxa"/>
-              <w:end w:w="120" w:type="dxa"/>
-            </w:tcMar>
-          </w:tcPr>
-          <w:p>
-            <w:pPr>
-              <w:spacing w:after="0"/>
-              <w:jc w:val="right"/>
-            </w:pPr>
-            <w:r>
-              <w:rPr>
-                <w:rFonts w:ascii="Calibri" w:hAnsi="Calibri"/>
-                <w:color w:val="20384A"/>
-                <w:sz w:val="18"/>
-              </w:rPr>
-              <w:t>$123.5M</w:t>
-            </w:r>
-          </w:p>
-        </w:tc>
-        <w:tc>
-          <w:tcPr>
-            <w:tcW w:type="dxa" w:w="2200"/>
-            <w:vAlign w:val="center"/>
-            <w:tcMar>
-              <w:top w:w="80" w:type="dxa"/>
-              <w:start w:w="120" w:type="dxa"/>
-              <w:bottom w:w="80" w:type="dxa"/>
-              <w:end w:w="120" w:type="dxa"/>
-            </w:tcMar>
-          </w:tcPr>
-          <w:p>
-            <w:pPr>
-              <w:spacing w:after="0"/>
-              <w:jc w:val="right"/>
-            </w:pPr>
-            <w:r>
-              <w:rPr>
-                <w:rFonts w:ascii="Calibri" w:hAnsi="Calibri"/>
-                <w:color w:val="20384A"/>
-                <w:sz w:val="18"/>
-              </w:rPr>
-              <w:t>$26.9M</w:t>
-            </w:r>
-          </w:p>
-        </w:tc>
-        <w:tc>
-          <w:tcPr>
-            <w:tcW w:type="dxa" w:w="1800"/>
-            <w:vAlign w:val="center"/>
-            <w:tcMar>
-              <w:top w:w="80" w:type="dxa"/>
-              <w:start w:w="120" w:type="dxa"/>
-              <w:bottom w:w="80" w:type="dxa"/>
-              <w:end w:w="120" w:type="dxa"/>
-            </w:tcMar>
-          </w:tcPr>
-          <w:p>
-            <w:pPr>
-              <w:spacing w:after="0"/>
-              <w:jc w:val="right"/>
-            </w:pPr>
-            <w:r>
-              <w:rPr>
-                <w:rFonts w:ascii="Calibri" w:hAnsi="Calibri"/>
-                <w:color w:val="20384A"/>
-                <w:sz w:val="18"/>
-              </w:rPr>
-              <w:t>21.76%</w:t>
-            </w:r>
-          </w:p>
-        </w:tc>
-        <w:tc>
-          <w:tcPr>
-            <w:tcW w:type="dxa" w:w="2260"/>
-            <w:vAlign w:val="center"/>
-            <w:tcMar>
-              <w:top w:w="80" w:type="dxa"/>
-              <w:start w:w="120" w:type="dxa"/>
-              <w:bottom w:w="80" w:type="dxa"/>
-              <w:end w:w="120" w:type="dxa"/>
-            </w:tcMar>
-          </w:tcPr>
-          <w:p>
-            <w:pPr>
-              <w:spacing w:after="0"/>
-              <w:jc w:val="right"/>
-            </w:pPr>
-            <w:r>
-              <w:rPr>
-                <w:rFonts w:ascii="Calibri" w:hAnsi="Calibri"/>
-                <w:color w:val="20384A"/>
-                <w:sz w:val="18"/>
-              </w:rPr>
-              <w:t>6.15%</w:t>
-            </w:r>
-          </w:p>
-        </w:tc>
-      </w:tr>
-      <w:tr>
-        <w:tc>
-          <w:tcPr>
-            <w:tcW w:type="dxa" w:w="900"/>
-            <w:vAlign w:val="center"/>
-            <w:tcMar>
-              <w:top w:w="80" w:type="dxa"/>
-              <w:start w:w="120" w:type="dxa"/>
-              <w:bottom w:w="80" w:type="dxa"/>
-              <w:end w:w="120" w:type="dxa"/>
-            </w:tcMar>
-          </w:tcPr>
-          <w:p>
-            <w:pPr>
-              <w:spacing w:after="0"/>
-              <w:jc w:val="center"/>
-            </w:pPr>
-            <w:r>
-              <w:rPr>
-                <w:rFonts w:ascii="Calibri" w:hAnsi="Calibri"/>
-                <w:color w:val="20384A"/>
-                <w:sz w:val="18"/>
-              </w:rPr>
-              <w:t>2024</w:t>
-            </w:r>
-          </w:p>
-        </w:tc>
-        <w:tc>
-          <w:tcPr>
-            <w:tcW w:type="dxa" w:w="2200"/>
-            <w:vAlign w:val="center"/>
-            <w:tcMar>
-              <w:top w:w="80" w:type="dxa"/>
-              <w:start w:w="120" w:type="dxa"/>
-              <w:bottom w:w="80" w:type="dxa"/>
-              <w:end w:w="120" w:type="dxa"/>
-            </w:tcMar>
-          </w:tcPr>
-          <w:p>
-            <w:pPr>
-              <w:spacing w:after="0"/>
-              <w:jc w:val="right"/>
-            </w:pPr>
-            <w:r>
-              <w:rPr>
-                <w:rFonts w:ascii="Calibri" w:hAnsi="Calibri"/>
-                <w:color w:val="20384A"/>
-                <w:sz w:val="18"/>
-              </w:rPr>
-              <w:t>$131.0M</w:t>
-            </w:r>
-          </w:p>
-        </w:tc>
-        <w:tc>
-          <w:tcPr>
-            <w:tcW w:type="dxa" w:w="2200"/>
-            <w:vAlign w:val="center"/>
-            <w:tcMar>
-              <w:top w:w="80" w:type="dxa"/>
-              <w:start w:w="120" w:type="dxa"/>
-              <w:bottom w:w="80" w:type="dxa"/>
-              <w:end w:w="120" w:type="dxa"/>
-            </w:tcMar>
-          </w:tcPr>
-          <w:p>
-            <w:pPr>
-              <w:spacing w:after="0"/>
-              <w:jc w:val="right"/>
-            </w:pPr>
-            <w:r>
-              <w:rPr>
-                <w:rFonts w:ascii="Calibri" w:hAnsi="Calibri"/>
-                <w:color w:val="20384A"/>
-                <w:sz w:val="18"/>
-              </w:rPr>
-              <w:t>$28.8M</w:t>
-            </w:r>
-          </w:p>
-        </w:tc>
-        <w:tc>
-          <w:tcPr>
-            <w:tcW w:type="dxa" w:w="1800"/>
-            <w:vAlign w:val="center"/>
-            <w:tcMar>
-              <w:top w:w="80" w:type="dxa"/>
-              <w:start w:w="120" w:type="dxa"/>
-              <w:bottom w:w="80" w:type="dxa"/>
-              <w:end w:w="120" w:type="dxa"/>
-            </w:tcMar>
-          </w:tcPr>
-          <w:p>
-            <w:pPr>
-              <w:spacing w:after="0"/>
-              <w:jc w:val="right"/>
-            </w:pPr>
-            <w:r>
-              <w:rPr>
-                <w:rFonts w:ascii="Calibri" w:hAnsi="Calibri"/>
-                <w:color w:val="20384A"/>
-                <w:sz w:val="18"/>
-              </w:rPr>
-              <w:t>22.01%</w:t>
-            </w:r>
-          </w:p>
-        </w:tc>
-        <w:tc>
-          <w:tcPr>
-            <w:tcW w:type="dxa" w:w="2260"/>
-            <w:vAlign w:val="center"/>
-            <w:tcMar>
-              <w:top w:w="80" w:type="dxa"/>
-              <w:start w:w="120" w:type="dxa"/>
-              <w:bottom w:w="80" w:type="dxa"/>
-              <w:end w:w="120" w:type="dxa"/>
-            </w:tcMar>
-          </w:tcPr>
-          <w:p>
-            <w:pPr>
-              <w:spacing w:after="0"/>
-              <w:jc w:val="right"/>
-            </w:pPr>
-            <w:r>
-              <w:rPr>
-                <w:rFonts w:ascii="Calibri" w:hAnsi="Calibri"/>
-                <w:color w:val="20384A"/>
-                <w:sz w:val="18"/>
-              </w:rPr>
-              <w:t>6.05%</w:t>
-            </w:r>
-          </w:p>
-        </w:tc>
-      </w:tr>
-    </w:tbl>
-    <w:p>
-      <w:pPr>
-        <w:keepLines/>
-      </w:pPr>
-      <w:r>
-        <w:rPr>
-          <w:rFonts w:ascii="Calibri" w:hAnsi="Calibri"/>
-          <w:color w:val="20384A"/>
-          <w:sz w:val="22"/>
-        </w:rPr>
-        <w:t>Revenue increased 65.0% over the period, while gross profit increased 89.6%. Margin expanded in five of six year-over-year comparisons. Revenue growth slowed to about 6% in both 2023 and 2024, but profit still outpaced revenue, which is consistent with maturing rather than deteriorating growth.</w:t>
-      </w:r>
-    </w:p>
-    <w:p>
-      <w:r>
-        <w:br w:type="page"/>
-      </w:r>
-    </w:p>
-    <w:p>
-      <w:pPr>
-        <w:pStyle w:val="Heading1"/>
-        <w:keepNext/>
-      </w:pPr>
-      <w:r>
-        <w:t>2. Customer Segment Profitability</w:t>
-      </w:r>
-    </w:p>
-    <w:p>
-      <w:pPr>
-        <w:spacing w:before="80" w:after="160"/>
-        <w:ind w:left="173" w:right="173"/>
-        <w:shd w:fill="D9EAF7"/>
-        <w:pBdr>
-          <w:left w:val="single" w:sz="18" w:space="8" w:color="2E74B5"/>
-        </w:pBdr>
-      </w:pPr>
-      <w:r>
-        <w:rPr>
-          <w:rFonts w:ascii="Calibri" w:hAnsi="Calibri"/>
-          <w:b/>
-          <w:color w:val="17365D"/>
-          <w:sz w:val="22"/>
-        </w:rPr>
-        <w:t>Independent Retail is both the economic engine and the principal segment-level exposure.</w:t>
+        <w:t>Independent Retail is the largest source of both revenue and gross profit.</w:t>
       </w:r>
     </w:p>
     <w:p>
@@ -2101,7 +910,7 @@
         <w:drawing>
           <wp:inline xmlns:a="http://schemas.openxmlformats.org/drawingml/2006/main" xmlns:pic="http://schemas.openxmlformats.org/drawingml/2006/picture">
             <wp:extent cx="5897880" cy="3759898"/>
-            <wp:docPr id="2" name="Picture 2" descr="Horizontal bars compare revenue share and gross-profit share for the ten largest historical customer segments." title="Horizontal bars compare revenue share and gross-profit share for the ten largest historical customer segments."/>
+            <wp:docPr id="1" name="Picture 1" descr="Horizontal bars compare revenue share and gross-profit share for the ten largest historical customer segments." title="Horizontal bars compare revenue share and gross-profit share for the ten largest historical customer segments."/>
             <wp:cNvGraphicFramePr>
               <a:graphicFrameLocks noChangeAspect="1"/>
             </wp:cNvGraphicFramePr>
@@ -2109,11 +918,11 @@
               <a:graphicData uri="http://schemas.openxmlformats.org/drawingml/2006/picture">
                 <pic:pic>
                   <pic:nvPicPr>
-                    <pic:cNvPr id="0" name="02_segment_profitability.png"/>
+                    <pic:cNvPr id="0" name="01_segment_profitability.png"/>
                     <pic:cNvPicPr/>
                   </pic:nvPicPr>
                   <pic:blipFill>
-                    <a:blip r:embed="rId12"/>
+                    <a:blip r:embed="rId11"/>
                     <a:stretch>
                       <a:fillRect/>
                     </a:stretch>
@@ -2145,7 +954,7 @@
           <w:color w:val="607184"/>
           <w:sz w:val="18"/>
         </w:rPr>
-        <w:t>Figure 2. Segment scale compared with profit contribution.</w:t>
+        <w:t>Figure 1. Segment revenue share compared with gross-profit share.</w:t>
       </w:r>
     </w:p>
     <w:tbl>
@@ -3456,7 +2265,7 @@
           <w:color w:val="20384A"/>
           <w:sz w:val="22"/>
         </w:rPr>
-        <w:t>Independent Retail produced 48.75% of revenue and 51.37% of gross profit at a 22.39% margin. It also generated 43.04% of company revenue growth from 2018 to 2024. Wholesale Trade is more margin-light: 14.12% of revenue but 12.59% of gross profit at an 18.94% margin. Retail Cooperative Network is a credible expansion candidate because its 2024 revenue was 111.18% above 2018 while margin improved to 25.40%.</w:t>
+        <w:t>Independent Retail produced 48.75% of revenue and 51.37% of gross profit at a 22.39% margin. The company should protect this business while watching how much it depends on one segment. Wholesale Trade is also large, but its 18.94% margin is lower. Retail Cooperative Network is a reasonable place to test focused growth because its revenue more than doubled from 2018 to 2024 while its margin improved.</w:t>
       </w:r>
     </w:p>
     <w:p>
@@ -3470,7 +2279,7 @@
         <w:keepNext/>
       </w:pPr>
       <w:r>
-        <w:t>3. Revenue Concentration Risk</w:t>
+        <w:t>2. Revenue Concentration</w:t>
       </w:r>
     </w:p>
     <w:p>
@@ -3489,7 +2298,7 @@
           <w:color w:val="17365D"/>
           <w:sz w:val="22"/>
         </w:rPr>
-        <w:t>Single-customer dependency is low; segment dependency is materially higher.</w:t>
+        <w:t>The company is not dependent on one large customer, but it does depend heavily on one customer segment.</w:t>
       </w:r>
     </w:p>
     <w:p>
@@ -3502,7 +2311,7 @@
         <w:drawing>
           <wp:inline xmlns:a="http://schemas.openxmlformats.org/drawingml/2006/main" xmlns:pic="http://schemas.openxmlformats.org/drawingml/2006/picture">
             <wp:extent cx="5897880" cy="3428143"/>
-            <wp:docPr id="3" name="Picture 3" descr="Cumulative revenue curve shows the share of recognized revenue produced by the ranked customer portfolio, with markers at 50, 80, and 90 percent." title="Cumulative revenue curve shows the share of recognized revenue produced by the ranked customer portfolio, with markers at 50, 80, and 90 percent."/>
+            <wp:docPr id="2" name="Picture 2" descr="Cumulative revenue curve shows the share of recognized revenue produced by the ranked customer portfolio, with markers at 50, 80, and 90 percent." title="Cumulative revenue curve shows the share of recognized revenue produced by the ranked customer portfolio, with markers at 50, 80, and 90 percent."/>
             <wp:cNvGraphicFramePr>
               <a:graphicFrameLocks noChangeAspect="1"/>
             </wp:cNvGraphicFramePr>
@@ -3510,11 +2319,11 @@
               <a:graphicData uri="http://schemas.openxmlformats.org/drawingml/2006/picture">
                 <pic:pic>
                   <pic:nvPicPr>
-                    <pic:cNvPr id="0" name="03_customer_concentration.png"/>
+                    <pic:cNvPr id="0" name="02_customer_concentration.png"/>
                     <pic:cNvPicPr/>
                   </pic:nvPicPr>
                   <pic:blipFill>
-                    <a:blip r:embed="rId13"/>
+                    <a:blip r:embed="rId12"/>
                     <a:stretch>
                       <a:fillRect/>
                     </a:stretch>
@@ -3546,7 +2355,7 @@
           <w:color w:val="607184"/>
           <w:sz w:val="18"/>
         </w:rPr>
-        <w:t>Figure 3. Customer-level cumulative revenue concentration.</w:t>
+        <w:t>Figure 2. Customer-level cumulative revenue concentration.</w:t>
       </w:r>
     </w:p>
     <w:tbl>
@@ -4067,7 +2876,7 @@
           <w:color w:val="20384A"/>
           <w:sz w:val="22"/>
         </w:rPr>
-        <w:t>The largest customer contributes only 1.13% of revenue, the top 10 contribute 7.09%, and the top 100 contribute 33.41%. It takes 599 customers, or 18.54% of the portfolio, to reach 80% of revenue. Leadership should therefore monitor correlated segment risks—pricing pressure, channel disruption, competitive shifts, or service failures—more closely than the loss of any single account.</w:t>
+        <w:t>The largest customer contributes only 1.13% of revenue, and it takes 599 customers to reach 80%. Losing one account would not put a large share of revenue at risk. A problem affecting many Independent Retail customers at the same time would matter much more, so the company should track concentration by segment as well as by customer.</w:t>
       </w:r>
     </w:p>
     <w:p>
@@ -4081,7 +2890,7 @@
         <w:keepNext/>
       </w:pPr>
       <w:r>
-        <w:t>4. Customer Lifecycle and Retention Risk</w:t>
+        <w:t>3. Customer Lifecycle and Retention Risk</w:t>
       </w:r>
     </w:p>
     <w:p>
@@ -4100,7 +2909,7 @@
           <w:color w:val="17365D"/>
           <w:sz w:val="22"/>
         </w:rPr>
-        <w:t>The non-active portfolio carries a $23.0M trailing revenue baseline; 82.27% sits in dormant accounts.</w:t>
+        <w:t>Non-active customers have a $23.0M trailing revenue baseline, but the best outreach targets are the recently inactive high-value accounts.</w:t>
       </w:r>
     </w:p>
     <w:p>
@@ -4113,7 +2922,7 @@
         <w:drawing>
           <wp:inline xmlns:a="http://schemas.openxmlformats.org/drawingml/2006/main" xmlns:pic="http://schemas.openxmlformats.org/drawingml/2006/picture">
             <wp:extent cx="5897880" cy="3022664"/>
-            <wp:docPr id="4" name="Picture 4" descr="Stacked bars compare customer lifecycle counts with the distribution of trailing revenue baseline at risk across watch, at-risk, dormant, active, and no-positive-sales groups." title="Stacked bars compare customer lifecycle counts with the distribution of trailing revenue baseline at risk across watch, at-risk, dormant, active, and no-positive-sales groups."/>
+            <wp:docPr id="3" name="Picture 3" descr="Stacked bars compare customer lifecycle counts with the distribution of trailing revenue baseline at risk across watch, at-risk, dormant, active, and no-positive-sales groups." title="Stacked bars compare customer lifecycle counts with the distribution of trailing revenue baseline at risk across watch, at-risk, dormant, active, and no-positive-sales groups."/>
             <wp:cNvGraphicFramePr>
               <a:graphicFrameLocks noChangeAspect="1"/>
             </wp:cNvGraphicFramePr>
@@ -4121,11 +2930,11 @@
               <a:graphicData uri="http://schemas.openxmlformats.org/drawingml/2006/picture">
                 <pic:pic>
                   <pic:nvPicPr>
-                    <pic:cNvPr id="0" name="04_retention_risk.png"/>
+                    <pic:cNvPr id="0" name="03_retention_risk.png"/>
                     <pic:cNvPicPr/>
                   </pic:nvPicPr>
                   <pic:blipFill>
-                    <a:blip r:embed="rId14"/>
+                    <a:blip r:embed="rId13"/>
                     <a:stretch>
                       <a:fillRect/>
                     </a:stretch>
@@ -4157,7 +2966,7 @@
           <w:color w:val="607184"/>
           <w:sz w:val="18"/>
         </w:rPr>
-        <w:t>Figure 4. Lifecycle mix and trailing revenue baseline at risk.</w:t>
+        <w:t>Figure 3. Lifecycle mix and trailing revenue baseline at risk.</w:t>
       </w:r>
     </w:p>
     <w:tbl>
@@ -4994,7 +3803,1198 @@
           <w:color w:val="20384A"/>
           <w:sz w:val="22"/>
         </w:rPr>
-        <w:t>The first outreach wave should focus on high-value customers inactive for 7-12 months, where intervention is still timely. Watch customers should receive lower-cost proactive outreach, while dormant accounts should be handled as a controlled reactivation test. Inactivity is only a behavioral flag; seasonality, planned buying cycles, mergers, or historical class changes may explain the absence of recent sales.</w:t>
+        <w:t>The company should contact high-value customers inactive for 7-12 months first, then use lower-cost reminders for the 4-6 month watch group. Dormant customers should be handled as a smaller test focused on the most valuable accounts. Inactivity is a warning sign, not proof that a customer has permanently left.</w:t>
+      </w:r>
+    </w:p>
+    <w:p>
+      <w:r>
+        <w:br w:type="page"/>
+      </w:r>
+    </w:p>
+    <w:p>
+      <w:pPr>
+        <w:pStyle w:val="Heading1"/>
+        <w:keepNext/>
+      </w:pPr>
+      <w:r>
+        <w:t>4. Revenue and Margin Trends</w:t>
+      </w:r>
+    </w:p>
+    <w:p>
+      <w:pPr>
+        <w:spacing w:before="80" w:after="160"/>
+        <w:ind w:left="173" w:right="173"/>
+        <w:shd w:fill="D9EAF7"/>
+        <w:pBdr>
+          <w:left w:val="single" w:sz="18" w:space="8" w:color="2E74B5"/>
+        </w:pBdr>
+      </w:pPr>
+      <w:r>
+        <w:rPr>
+          <w:rFonts w:ascii="Calibri" w:hAnsi="Calibri"/>
+          <w:b/>
+          <w:color w:val="17365D"/>
+          <w:sz w:val="22"/>
+        </w:rPr>
+        <w:t>Revenue rose every year, gross profit grew faster, and gross margin improved.</w:t>
+      </w:r>
+    </w:p>
+    <w:p>
+      <w:pPr>
+        <w:keepNext/>
+        <w:spacing w:before="40" w:after="40"/>
+        <w:jc w:val="center"/>
+      </w:pPr>
+      <w:r>
+        <w:drawing>
+          <wp:inline xmlns:a="http://schemas.openxmlformats.org/drawingml/2006/main" xmlns:pic="http://schemas.openxmlformats.org/drawingml/2006/picture">
+            <wp:extent cx="5897880" cy="3317558"/>
+            <wp:docPr id="4" name="Picture 4" descr="Stacked annual revenue bars show cost and gross profit from 2018 through 2024, with an accompanying gross-margin line rising from 19.15 percent to 22.01 percent." title="Stacked annual revenue bars show cost and gross profit from 2018 through 2024, with an accompanying gross-margin line rising from 19.15 percent to 22.01 percent."/>
+            <wp:cNvGraphicFramePr>
+              <a:graphicFrameLocks noChangeAspect="1"/>
+            </wp:cNvGraphicFramePr>
+            <a:graphic>
+              <a:graphicData uri="http://schemas.openxmlformats.org/drawingml/2006/picture">
+                <pic:pic>
+                  <pic:nvPicPr>
+                    <pic:cNvPr id="0" name="04_revenue_margin_trends.png"/>
+                    <pic:cNvPicPr/>
+                  </pic:nvPicPr>
+                  <pic:blipFill>
+                    <a:blip r:embed="rId14"/>
+                    <a:stretch>
+                      <a:fillRect/>
+                    </a:stretch>
+                  </pic:blipFill>
+                  <pic:spPr>
+                    <a:xfrm>
+                      <a:off x="0" y="0"/>
+                      <a:ext cx="5897880" cy="3317558"/>
+                    </a:xfrm>
+                    <a:prstGeom prst="rect"/>
+                  </pic:spPr>
+                </pic:pic>
+              </a:graphicData>
+            </a:graphic>
+          </wp:inline>
+        </w:drawing>
+      </w:r>
+    </w:p>
+    <w:p>
+      <w:pPr>
+        <w:pStyle w:val="Caption"/>
+        <w:spacing w:before="40" w:after="160"/>
+        <w:jc w:val="center"/>
+      </w:pPr>
+      <w:r>
+        <w:rPr>
+          <w:rFonts w:ascii="Calibri" w:hAnsi="Calibri"/>
+          <w:i/>
+          <w:color w:val="607184"/>
+          <w:sz w:val="18"/>
+        </w:rPr>
+        <w:t>Figure 4. Annual recognized revenue and gross-margin trend.</w:t>
+      </w:r>
+    </w:p>
+    <w:tbl>
+      <w:tblPr>
+        <w:tblW w:type="dxa" w:w="9360"/>
+        <w:tblLayout w:type="fixed"/>
+        <w:tblLook w:firstColumn="1" w:firstRow="1" w:lastColumn="0" w:lastRow="0" w:noHBand="0" w:noVBand="1" w:val="04A0"/>
+        <w:jc w:val="left"/>
+        <w:tblInd w:w="120" w:type="dxa"/>
+        <w:tblBorders>
+          <w:top w:val="single" w:sz="4" w:color="D9E0E7"/>
+          <w:left w:val="single" w:sz="4" w:color="D9E0E7"/>
+          <w:bottom w:val="single" w:sz="4" w:color="D9E0E7"/>
+          <w:right w:val="single" w:sz="4" w:color="D9E0E7"/>
+          <w:insideH w:val="single" w:sz="4" w:color="D9E0E7"/>
+          <w:insideV w:val="single" w:sz="4" w:color="D9E0E7"/>
+        </w:tblBorders>
+      </w:tblPr>
+      <w:tblGrid>
+        <w:gridCol w:w="900"/>
+        <w:gridCol w:w="2200"/>
+        <w:gridCol w:w="2200"/>
+        <w:gridCol w:w="1800"/>
+        <w:gridCol w:w="2260"/>
+      </w:tblGrid>
+      <w:tr>
+        <w:trPr>
+          <w:tblHeader w:val="true"/>
+        </w:trPr>
+        <w:tc>
+          <w:tcPr>
+            <w:tcW w:type="dxa" w:w="900"/>
+            <w:tcMar>
+              <w:top w:w="80" w:type="dxa"/>
+              <w:start w:w="120" w:type="dxa"/>
+              <w:bottom w:w="80" w:type="dxa"/>
+              <w:end w:w="120" w:type="dxa"/>
+            </w:tcMar>
+            <w:shd w:fill="F2F4F7"/>
+            <w:vAlign w:val="center"/>
+          </w:tcPr>
+          <w:p>
+            <w:pPr>
+              <w:spacing w:after="0"/>
+            </w:pPr>
+            <w:r>
+              <w:rPr>
+                <w:rFonts w:ascii="Calibri" w:hAnsi="Calibri"/>
+                <w:b/>
+                <w:color w:val="17365D"/>
+                <w:sz w:val="18"/>
+              </w:rPr>
+              <w:t>Year</w:t>
+            </w:r>
+          </w:p>
+        </w:tc>
+        <w:tc>
+          <w:tcPr>
+            <w:tcW w:type="dxa" w:w="2200"/>
+            <w:tcMar>
+              <w:top w:w="80" w:type="dxa"/>
+              <w:start w:w="120" w:type="dxa"/>
+              <w:bottom w:w="80" w:type="dxa"/>
+              <w:end w:w="120" w:type="dxa"/>
+            </w:tcMar>
+            <w:shd w:fill="F2F4F7"/>
+            <w:vAlign w:val="center"/>
+          </w:tcPr>
+          <w:p>
+            <w:pPr>
+              <w:spacing w:after="0"/>
+            </w:pPr>
+            <w:r>
+              <w:rPr>
+                <w:rFonts w:ascii="Calibri" w:hAnsi="Calibri"/>
+                <w:b/>
+                <w:color w:val="17365D"/>
+                <w:sz w:val="18"/>
+              </w:rPr>
+              <w:t>Revenue</w:t>
+            </w:r>
+          </w:p>
+        </w:tc>
+        <w:tc>
+          <w:tcPr>
+            <w:tcW w:type="dxa" w:w="2200"/>
+            <w:tcMar>
+              <w:top w:w="80" w:type="dxa"/>
+              <w:start w:w="120" w:type="dxa"/>
+              <w:bottom w:w="80" w:type="dxa"/>
+              <w:end w:w="120" w:type="dxa"/>
+            </w:tcMar>
+            <w:shd w:fill="F2F4F7"/>
+            <w:vAlign w:val="center"/>
+          </w:tcPr>
+          <w:p>
+            <w:pPr>
+              <w:spacing w:after="0"/>
+            </w:pPr>
+            <w:r>
+              <w:rPr>
+                <w:rFonts w:ascii="Calibri" w:hAnsi="Calibri"/>
+                <w:b/>
+                <w:color w:val="17365D"/>
+                <w:sz w:val="18"/>
+              </w:rPr>
+              <w:t>Gross profit</w:t>
+            </w:r>
+          </w:p>
+        </w:tc>
+        <w:tc>
+          <w:tcPr>
+            <w:tcW w:type="dxa" w:w="1800"/>
+            <w:tcMar>
+              <w:top w:w="80" w:type="dxa"/>
+              <w:start w:w="120" w:type="dxa"/>
+              <w:bottom w:w="80" w:type="dxa"/>
+              <w:end w:w="120" w:type="dxa"/>
+            </w:tcMar>
+            <w:shd w:fill="F2F4F7"/>
+            <w:vAlign w:val="center"/>
+          </w:tcPr>
+          <w:p>
+            <w:pPr>
+              <w:spacing w:after="0"/>
+            </w:pPr>
+            <w:r>
+              <w:rPr>
+                <w:rFonts w:ascii="Calibri" w:hAnsi="Calibri"/>
+                <w:b/>
+                <w:color w:val="17365D"/>
+                <w:sz w:val="18"/>
+              </w:rPr>
+              <w:t>Margin</w:t>
+            </w:r>
+          </w:p>
+        </w:tc>
+        <w:tc>
+          <w:tcPr>
+            <w:tcW w:type="dxa" w:w="2260"/>
+            <w:tcMar>
+              <w:top w:w="80" w:type="dxa"/>
+              <w:start w:w="120" w:type="dxa"/>
+              <w:bottom w:w="80" w:type="dxa"/>
+              <w:end w:w="120" w:type="dxa"/>
+            </w:tcMar>
+            <w:shd w:fill="F2F4F7"/>
+            <w:vAlign w:val="center"/>
+          </w:tcPr>
+          <w:p>
+            <w:pPr>
+              <w:spacing w:after="0"/>
+            </w:pPr>
+            <w:r>
+              <w:rPr>
+                <w:rFonts w:ascii="Calibri" w:hAnsi="Calibri"/>
+                <w:b/>
+                <w:color w:val="17365D"/>
+                <w:sz w:val="18"/>
+              </w:rPr>
+              <w:t>Revenue YoY</w:t>
+            </w:r>
+          </w:p>
+        </w:tc>
+      </w:tr>
+      <w:tr>
+        <w:tc>
+          <w:tcPr>
+            <w:tcW w:type="dxa" w:w="900"/>
+            <w:vAlign w:val="center"/>
+            <w:tcMar>
+              <w:top w:w="80" w:type="dxa"/>
+              <w:start w:w="120" w:type="dxa"/>
+              <w:bottom w:w="80" w:type="dxa"/>
+              <w:end w:w="120" w:type="dxa"/>
+            </w:tcMar>
+          </w:tcPr>
+          <w:p>
+            <w:pPr>
+              <w:spacing w:after="0"/>
+              <w:jc w:val="center"/>
+            </w:pPr>
+            <w:r>
+              <w:rPr>
+                <w:rFonts w:ascii="Calibri" w:hAnsi="Calibri"/>
+                <w:color w:val="20384A"/>
+                <w:sz w:val="18"/>
+              </w:rPr>
+              <w:t>2018</w:t>
+            </w:r>
+          </w:p>
+        </w:tc>
+        <w:tc>
+          <w:tcPr>
+            <w:tcW w:type="dxa" w:w="2200"/>
+            <w:vAlign w:val="center"/>
+            <w:tcMar>
+              <w:top w:w="80" w:type="dxa"/>
+              <w:start w:w="120" w:type="dxa"/>
+              <w:bottom w:w="80" w:type="dxa"/>
+              <w:end w:w="120" w:type="dxa"/>
+            </w:tcMar>
+          </w:tcPr>
+          <w:p>
+            <w:pPr>
+              <w:spacing w:after="0"/>
+              <w:jc w:val="right"/>
+            </w:pPr>
+            <w:r>
+              <w:rPr>
+                <w:rFonts w:ascii="Calibri" w:hAnsi="Calibri"/>
+                <w:color w:val="20384A"/>
+                <w:sz w:val="18"/>
+              </w:rPr>
+              <w:t>$79.4M</w:t>
+            </w:r>
+          </w:p>
+        </w:tc>
+        <w:tc>
+          <w:tcPr>
+            <w:tcW w:type="dxa" w:w="2200"/>
+            <w:vAlign w:val="center"/>
+            <w:tcMar>
+              <w:top w:w="80" w:type="dxa"/>
+              <w:start w:w="120" w:type="dxa"/>
+              <w:bottom w:w="80" w:type="dxa"/>
+              <w:end w:w="120" w:type="dxa"/>
+            </w:tcMar>
+          </w:tcPr>
+          <w:p>
+            <w:pPr>
+              <w:spacing w:after="0"/>
+              <w:jc w:val="right"/>
+            </w:pPr>
+            <w:r>
+              <w:rPr>
+                <w:rFonts w:ascii="Calibri" w:hAnsi="Calibri"/>
+                <w:color w:val="20384A"/>
+                <w:sz w:val="18"/>
+              </w:rPr>
+              <w:t>$15.2M</w:t>
+            </w:r>
+          </w:p>
+        </w:tc>
+        <w:tc>
+          <w:tcPr>
+            <w:tcW w:type="dxa" w:w="1800"/>
+            <w:vAlign w:val="center"/>
+            <w:tcMar>
+              <w:top w:w="80" w:type="dxa"/>
+              <w:start w:w="120" w:type="dxa"/>
+              <w:bottom w:w="80" w:type="dxa"/>
+              <w:end w:w="120" w:type="dxa"/>
+            </w:tcMar>
+          </w:tcPr>
+          <w:p>
+            <w:pPr>
+              <w:spacing w:after="0"/>
+              <w:jc w:val="right"/>
+            </w:pPr>
+            <w:r>
+              <w:rPr>
+                <w:rFonts w:ascii="Calibri" w:hAnsi="Calibri"/>
+                <w:color w:val="20384A"/>
+                <w:sz w:val="18"/>
+              </w:rPr>
+              <w:t>19.15%</w:t>
+            </w:r>
+          </w:p>
+        </w:tc>
+        <w:tc>
+          <w:tcPr>
+            <w:tcW w:type="dxa" w:w="2260"/>
+            <w:vAlign w:val="center"/>
+            <w:tcMar>
+              <w:top w:w="80" w:type="dxa"/>
+              <w:start w:w="120" w:type="dxa"/>
+              <w:bottom w:w="80" w:type="dxa"/>
+              <w:end w:w="120" w:type="dxa"/>
+            </w:tcMar>
+          </w:tcPr>
+          <w:p>
+            <w:pPr>
+              <w:spacing w:after="0"/>
+              <w:jc w:val="right"/>
+            </w:pPr>
+            <w:r>
+              <w:rPr>
+                <w:rFonts w:ascii="Calibri" w:hAnsi="Calibri"/>
+                <w:color w:val="20384A"/>
+                <w:sz w:val="18"/>
+              </w:rPr>
+              <w:t>-</w:t>
+            </w:r>
+          </w:p>
+        </w:tc>
+      </w:tr>
+      <w:tr>
+        <w:tc>
+          <w:tcPr>
+            <w:tcW w:type="dxa" w:w="900"/>
+            <w:vAlign w:val="center"/>
+            <w:tcMar>
+              <w:top w:w="80" w:type="dxa"/>
+              <w:start w:w="120" w:type="dxa"/>
+              <w:bottom w:w="80" w:type="dxa"/>
+              <w:end w:w="120" w:type="dxa"/>
+            </w:tcMar>
+          </w:tcPr>
+          <w:p>
+            <w:pPr>
+              <w:spacing w:after="0"/>
+              <w:jc w:val="center"/>
+            </w:pPr>
+            <w:r>
+              <w:rPr>
+                <w:rFonts w:ascii="Calibri" w:hAnsi="Calibri"/>
+                <w:color w:val="20384A"/>
+                <w:sz w:val="18"/>
+              </w:rPr>
+              <w:t>2019</w:t>
+            </w:r>
+          </w:p>
+        </w:tc>
+        <w:tc>
+          <w:tcPr>
+            <w:tcW w:type="dxa" w:w="2200"/>
+            <w:vAlign w:val="center"/>
+            <w:tcMar>
+              <w:top w:w="80" w:type="dxa"/>
+              <w:start w:w="120" w:type="dxa"/>
+              <w:bottom w:w="80" w:type="dxa"/>
+              <w:end w:w="120" w:type="dxa"/>
+            </w:tcMar>
+          </w:tcPr>
+          <w:p>
+            <w:pPr>
+              <w:spacing w:after="0"/>
+              <w:jc w:val="right"/>
+            </w:pPr>
+            <w:r>
+              <w:rPr>
+                <w:rFonts w:ascii="Calibri" w:hAnsi="Calibri"/>
+                <w:color w:val="20384A"/>
+                <w:sz w:val="18"/>
+              </w:rPr>
+              <w:t>$82.9M</w:t>
+            </w:r>
+          </w:p>
+        </w:tc>
+        <w:tc>
+          <w:tcPr>
+            <w:tcW w:type="dxa" w:w="2200"/>
+            <w:vAlign w:val="center"/>
+            <w:tcMar>
+              <w:top w:w="80" w:type="dxa"/>
+              <w:start w:w="120" w:type="dxa"/>
+              <w:bottom w:w="80" w:type="dxa"/>
+              <w:end w:w="120" w:type="dxa"/>
+            </w:tcMar>
+          </w:tcPr>
+          <w:p>
+            <w:pPr>
+              <w:spacing w:after="0"/>
+              <w:jc w:val="right"/>
+            </w:pPr>
+            <w:r>
+              <w:rPr>
+                <w:rFonts w:ascii="Calibri" w:hAnsi="Calibri"/>
+                <w:color w:val="20384A"/>
+                <w:sz w:val="18"/>
+              </w:rPr>
+              <w:t>$17.0M</w:t>
+            </w:r>
+          </w:p>
+        </w:tc>
+        <w:tc>
+          <w:tcPr>
+            <w:tcW w:type="dxa" w:w="1800"/>
+            <w:vAlign w:val="center"/>
+            <w:tcMar>
+              <w:top w:w="80" w:type="dxa"/>
+              <w:start w:w="120" w:type="dxa"/>
+              <w:bottom w:w="80" w:type="dxa"/>
+              <w:end w:w="120" w:type="dxa"/>
+            </w:tcMar>
+          </w:tcPr>
+          <w:p>
+            <w:pPr>
+              <w:spacing w:after="0"/>
+              <w:jc w:val="right"/>
+            </w:pPr>
+            <w:r>
+              <w:rPr>
+                <w:rFonts w:ascii="Calibri" w:hAnsi="Calibri"/>
+                <w:color w:val="20384A"/>
+                <w:sz w:val="18"/>
+              </w:rPr>
+              <w:t>20.47%</w:t>
+            </w:r>
+          </w:p>
+        </w:tc>
+        <w:tc>
+          <w:tcPr>
+            <w:tcW w:type="dxa" w:w="2260"/>
+            <w:vAlign w:val="center"/>
+            <w:tcMar>
+              <w:top w:w="80" w:type="dxa"/>
+              <w:start w:w="120" w:type="dxa"/>
+              <w:bottom w:w="80" w:type="dxa"/>
+              <w:end w:w="120" w:type="dxa"/>
+            </w:tcMar>
+          </w:tcPr>
+          <w:p>
+            <w:pPr>
+              <w:spacing w:after="0"/>
+              <w:jc w:val="right"/>
+            </w:pPr>
+            <w:r>
+              <w:rPr>
+                <w:rFonts w:ascii="Calibri" w:hAnsi="Calibri"/>
+                <w:color w:val="20384A"/>
+                <w:sz w:val="18"/>
+              </w:rPr>
+              <w:t>4.49%</w:t>
+            </w:r>
+          </w:p>
+        </w:tc>
+      </w:tr>
+      <w:tr>
+        <w:tc>
+          <w:tcPr>
+            <w:tcW w:type="dxa" w:w="900"/>
+            <w:vAlign w:val="center"/>
+            <w:tcMar>
+              <w:top w:w="80" w:type="dxa"/>
+              <w:start w:w="120" w:type="dxa"/>
+              <w:bottom w:w="80" w:type="dxa"/>
+              <w:end w:w="120" w:type="dxa"/>
+            </w:tcMar>
+          </w:tcPr>
+          <w:p>
+            <w:pPr>
+              <w:spacing w:after="0"/>
+              <w:jc w:val="center"/>
+            </w:pPr>
+            <w:r>
+              <w:rPr>
+                <w:rFonts w:ascii="Calibri" w:hAnsi="Calibri"/>
+                <w:color w:val="20384A"/>
+                <w:sz w:val="18"/>
+              </w:rPr>
+              <w:t>2020</w:t>
+            </w:r>
+          </w:p>
+        </w:tc>
+        <w:tc>
+          <w:tcPr>
+            <w:tcW w:type="dxa" w:w="2200"/>
+            <w:vAlign w:val="center"/>
+            <w:tcMar>
+              <w:top w:w="80" w:type="dxa"/>
+              <w:start w:w="120" w:type="dxa"/>
+              <w:bottom w:w="80" w:type="dxa"/>
+              <w:end w:w="120" w:type="dxa"/>
+            </w:tcMar>
+          </w:tcPr>
+          <w:p>
+            <w:pPr>
+              <w:spacing w:after="0"/>
+              <w:jc w:val="right"/>
+            </w:pPr>
+            <w:r>
+              <w:rPr>
+                <w:rFonts w:ascii="Calibri" w:hAnsi="Calibri"/>
+                <w:color w:val="20384A"/>
+                <w:sz w:val="18"/>
+              </w:rPr>
+              <w:t>$88.3M</w:t>
+            </w:r>
+          </w:p>
+        </w:tc>
+        <w:tc>
+          <w:tcPr>
+            <w:tcW w:type="dxa" w:w="2200"/>
+            <w:vAlign w:val="center"/>
+            <w:tcMar>
+              <w:top w:w="80" w:type="dxa"/>
+              <w:start w:w="120" w:type="dxa"/>
+              <w:bottom w:w="80" w:type="dxa"/>
+              <w:end w:w="120" w:type="dxa"/>
+            </w:tcMar>
+          </w:tcPr>
+          <w:p>
+            <w:pPr>
+              <w:spacing w:after="0"/>
+              <w:jc w:val="right"/>
+            </w:pPr>
+            <w:r>
+              <w:rPr>
+                <w:rFonts w:ascii="Calibri" w:hAnsi="Calibri"/>
+                <w:color w:val="20384A"/>
+                <w:sz w:val="18"/>
+              </w:rPr>
+              <w:t>$18.9M</w:t>
+            </w:r>
+          </w:p>
+        </w:tc>
+        <w:tc>
+          <w:tcPr>
+            <w:tcW w:type="dxa" w:w="1800"/>
+            <w:vAlign w:val="center"/>
+            <w:tcMar>
+              <w:top w:w="80" w:type="dxa"/>
+              <w:start w:w="120" w:type="dxa"/>
+              <w:bottom w:w="80" w:type="dxa"/>
+              <w:end w:w="120" w:type="dxa"/>
+            </w:tcMar>
+          </w:tcPr>
+          <w:p>
+            <w:pPr>
+              <w:spacing w:after="0"/>
+              <w:jc w:val="right"/>
+            </w:pPr>
+            <w:r>
+              <w:rPr>
+                <w:rFonts w:ascii="Calibri" w:hAnsi="Calibri"/>
+                <w:color w:val="20384A"/>
+                <w:sz w:val="18"/>
+              </w:rPr>
+              <w:t>21.43%</w:t>
+            </w:r>
+          </w:p>
+        </w:tc>
+        <w:tc>
+          <w:tcPr>
+            <w:tcW w:type="dxa" w:w="2260"/>
+            <w:vAlign w:val="center"/>
+            <w:tcMar>
+              <w:top w:w="80" w:type="dxa"/>
+              <w:start w:w="120" w:type="dxa"/>
+              <w:bottom w:w="80" w:type="dxa"/>
+              <w:end w:w="120" w:type="dxa"/>
+            </w:tcMar>
+          </w:tcPr>
+          <w:p>
+            <w:pPr>
+              <w:spacing w:after="0"/>
+              <w:jc w:val="right"/>
+            </w:pPr>
+            <w:r>
+              <w:rPr>
+                <w:rFonts w:ascii="Calibri" w:hAnsi="Calibri"/>
+                <w:color w:val="20384A"/>
+                <w:sz w:val="18"/>
+              </w:rPr>
+              <w:t>6.44%</w:t>
+            </w:r>
+          </w:p>
+        </w:tc>
+      </w:tr>
+      <w:tr>
+        <w:tc>
+          <w:tcPr>
+            <w:tcW w:type="dxa" w:w="900"/>
+            <w:vAlign w:val="center"/>
+            <w:tcMar>
+              <w:top w:w="80" w:type="dxa"/>
+              <w:start w:w="120" w:type="dxa"/>
+              <w:bottom w:w="80" w:type="dxa"/>
+              <w:end w:w="120" w:type="dxa"/>
+            </w:tcMar>
+          </w:tcPr>
+          <w:p>
+            <w:pPr>
+              <w:spacing w:after="0"/>
+              <w:jc w:val="center"/>
+            </w:pPr>
+            <w:r>
+              <w:rPr>
+                <w:rFonts w:ascii="Calibri" w:hAnsi="Calibri"/>
+                <w:color w:val="20384A"/>
+                <w:sz w:val="18"/>
+              </w:rPr>
+              <w:t>2021</w:t>
+            </w:r>
+          </w:p>
+        </w:tc>
+        <w:tc>
+          <w:tcPr>
+            <w:tcW w:type="dxa" w:w="2200"/>
+            <w:vAlign w:val="center"/>
+            <w:tcMar>
+              <w:top w:w="80" w:type="dxa"/>
+              <w:start w:w="120" w:type="dxa"/>
+              <w:bottom w:w="80" w:type="dxa"/>
+              <w:end w:w="120" w:type="dxa"/>
+            </w:tcMar>
+          </w:tcPr>
+          <w:p>
+            <w:pPr>
+              <w:spacing w:after="0"/>
+              <w:jc w:val="right"/>
+            </w:pPr>
+            <w:r>
+              <w:rPr>
+                <w:rFonts w:ascii="Calibri" w:hAnsi="Calibri"/>
+                <w:color w:val="20384A"/>
+                <w:sz w:val="18"/>
+              </w:rPr>
+              <w:t>$103.0M</w:t>
+            </w:r>
+          </w:p>
+        </w:tc>
+        <w:tc>
+          <w:tcPr>
+            <w:tcW w:type="dxa" w:w="2200"/>
+            <w:vAlign w:val="center"/>
+            <w:tcMar>
+              <w:top w:w="80" w:type="dxa"/>
+              <w:start w:w="120" w:type="dxa"/>
+              <w:bottom w:w="80" w:type="dxa"/>
+              <w:end w:w="120" w:type="dxa"/>
+            </w:tcMar>
+          </w:tcPr>
+          <w:p>
+            <w:pPr>
+              <w:spacing w:after="0"/>
+              <w:jc w:val="right"/>
+            </w:pPr>
+            <w:r>
+              <w:rPr>
+                <w:rFonts w:ascii="Calibri" w:hAnsi="Calibri"/>
+                <w:color w:val="20384A"/>
+                <w:sz w:val="18"/>
+              </w:rPr>
+              <w:t>$22.0M</w:t>
+            </w:r>
+          </w:p>
+        </w:tc>
+        <w:tc>
+          <w:tcPr>
+            <w:tcW w:type="dxa" w:w="1800"/>
+            <w:vAlign w:val="center"/>
+            <w:tcMar>
+              <w:top w:w="80" w:type="dxa"/>
+              <w:start w:w="120" w:type="dxa"/>
+              <w:bottom w:w="80" w:type="dxa"/>
+              <w:end w:w="120" w:type="dxa"/>
+            </w:tcMar>
+          </w:tcPr>
+          <w:p>
+            <w:pPr>
+              <w:spacing w:after="0"/>
+              <w:jc w:val="right"/>
+            </w:pPr>
+            <w:r>
+              <w:rPr>
+                <w:rFonts w:ascii="Calibri" w:hAnsi="Calibri"/>
+                <w:color w:val="20384A"/>
+                <w:sz w:val="18"/>
+              </w:rPr>
+              <w:t>21.39%</w:t>
+            </w:r>
+          </w:p>
+        </w:tc>
+        <w:tc>
+          <w:tcPr>
+            <w:tcW w:type="dxa" w:w="2260"/>
+            <w:vAlign w:val="center"/>
+            <w:tcMar>
+              <w:top w:w="80" w:type="dxa"/>
+              <w:start w:w="120" w:type="dxa"/>
+              <w:bottom w:w="80" w:type="dxa"/>
+              <w:end w:w="120" w:type="dxa"/>
+            </w:tcMar>
+          </w:tcPr>
+          <w:p>
+            <w:pPr>
+              <w:spacing w:after="0"/>
+              <w:jc w:val="right"/>
+            </w:pPr>
+            <w:r>
+              <w:rPr>
+                <w:rFonts w:ascii="Calibri" w:hAnsi="Calibri"/>
+                <w:color w:val="20384A"/>
+                <w:sz w:val="18"/>
+              </w:rPr>
+              <w:t>16.65%</w:t>
+            </w:r>
+          </w:p>
+        </w:tc>
+      </w:tr>
+      <w:tr>
+        <w:tc>
+          <w:tcPr>
+            <w:tcW w:type="dxa" w:w="900"/>
+            <w:vAlign w:val="center"/>
+            <w:tcMar>
+              <w:top w:w="80" w:type="dxa"/>
+              <w:start w:w="120" w:type="dxa"/>
+              <w:bottom w:w="80" w:type="dxa"/>
+              <w:end w:w="120" w:type="dxa"/>
+            </w:tcMar>
+          </w:tcPr>
+          <w:p>
+            <w:pPr>
+              <w:spacing w:after="0"/>
+              <w:jc w:val="center"/>
+            </w:pPr>
+            <w:r>
+              <w:rPr>
+                <w:rFonts w:ascii="Calibri" w:hAnsi="Calibri"/>
+                <w:color w:val="20384A"/>
+                <w:sz w:val="18"/>
+              </w:rPr>
+              <w:t>2022</w:t>
+            </w:r>
+          </w:p>
+        </w:tc>
+        <w:tc>
+          <w:tcPr>
+            <w:tcW w:type="dxa" w:w="2200"/>
+            <w:vAlign w:val="center"/>
+            <w:tcMar>
+              <w:top w:w="80" w:type="dxa"/>
+              <w:start w:w="120" w:type="dxa"/>
+              <w:bottom w:w="80" w:type="dxa"/>
+              <w:end w:w="120" w:type="dxa"/>
+            </w:tcMar>
+          </w:tcPr>
+          <w:p>
+            <w:pPr>
+              <w:spacing w:after="0"/>
+              <w:jc w:val="right"/>
+            </w:pPr>
+            <w:r>
+              <w:rPr>
+                <w:rFonts w:ascii="Calibri" w:hAnsi="Calibri"/>
+                <w:color w:val="20384A"/>
+                <w:sz w:val="18"/>
+              </w:rPr>
+              <w:t>$116.4M</w:t>
+            </w:r>
+          </w:p>
+        </w:tc>
+        <w:tc>
+          <w:tcPr>
+            <w:tcW w:type="dxa" w:w="2200"/>
+            <w:vAlign w:val="center"/>
+            <w:tcMar>
+              <w:top w:w="80" w:type="dxa"/>
+              <w:start w:w="120" w:type="dxa"/>
+              <w:bottom w:w="80" w:type="dxa"/>
+              <w:end w:w="120" w:type="dxa"/>
+            </w:tcMar>
+          </w:tcPr>
+          <w:p>
+            <w:pPr>
+              <w:spacing w:after="0"/>
+              <w:jc w:val="right"/>
+            </w:pPr>
+            <w:r>
+              <w:rPr>
+                <w:rFonts w:ascii="Calibri" w:hAnsi="Calibri"/>
+                <w:color w:val="20384A"/>
+                <w:sz w:val="18"/>
+              </w:rPr>
+              <w:t>$25.1M</w:t>
+            </w:r>
+          </w:p>
+        </w:tc>
+        <w:tc>
+          <w:tcPr>
+            <w:tcW w:type="dxa" w:w="1800"/>
+            <w:vAlign w:val="center"/>
+            <w:tcMar>
+              <w:top w:w="80" w:type="dxa"/>
+              <w:start w:w="120" w:type="dxa"/>
+              <w:bottom w:w="80" w:type="dxa"/>
+              <w:end w:w="120" w:type="dxa"/>
+            </w:tcMar>
+          </w:tcPr>
+          <w:p>
+            <w:pPr>
+              <w:spacing w:after="0"/>
+              <w:jc w:val="right"/>
+            </w:pPr>
+            <w:r>
+              <w:rPr>
+                <w:rFonts w:ascii="Calibri" w:hAnsi="Calibri"/>
+                <w:color w:val="20384A"/>
+                <w:sz w:val="18"/>
+              </w:rPr>
+              <w:t>21.56%</w:t>
+            </w:r>
+          </w:p>
+        </w:tc>
+        <w:tc>
+          <w:tcPr>
+            <w:tcW w:type="dxa" w:w="2260"/>
+            <w:vAlign w:val="center"/>
+            <w:tcMar>
+              <w:top w:w="80" w:type="dxa"/>
+              <w:start w:w="120" w:type="dxa"/>
+              <w:bottom w:w="80" w:type="dxa"/>
+              <w:end w:w="120" w:type="dxa"/>
+            </w:tcMar>
+          </w:tcPr>
+          <w:p>
+            <w:pPr>
+              <w:spacing w:after="0"/>
+              <w:jc w:val="right"/>
+            </w:pPr>
+            <w:r>
+              <w:rPr>
+                <w:rFonts w:ascii="Calibri" w:hAnsi="Calibri"/>
+                <w:color w:val="20384A"/>
+                <w:sz w:val="18"/>
+              </w:rPr>
+              <w:t>12.99%</w:t>
+            </w:r>
+          </w:p>
+        </w:tc>
+      </w:tr>
+      <w:tr>
+        <w:tc>
+          <w:tcPr>
+            <w:tcW w:type="dxa" w:w="900"/>
+            <w:vAlign w:val="center"/>
+            <w:tcMar>
+              <w:top w:w="80" w:type="dxa"/>
+              <w:start w:w="120" w:type="dxa"/>
+              <w:bottom w:w="80" w:type="dxa"/>
+              <w:end w:w="120" w:type="dxa"/>
+            </w:tcMar>
+          </w:tcPr>
+          <w:p>
+            <w:pPr>
+              <w:spacing w:after="0"/>
+              <w:jc w:val="center"/>
+            </w:pPr>
+            <w:r>
+              <w:rPr>
+                <w:rFonts w:ascii="Calibri" w:hAnsi="Calibri"/>
+                <w:color w:val="20384A"/>
+                <w:sz w:val="18"/>
+              </w:rPr>
+              <w:t>2023</w:t>
+            </w:r>
+          </w:p>
+        </w:tc>
+        <w:tc>
+          <w:tcPr>
+            <w:tcW w:type="dxa" w:w="2200"/>
+            <w:vAlign w:val="center"/>
+            <w:tcMar>
+              <w:top w:w="80" w:type="dxa"/>
+              <w:start w:w="120" w:type="dxa"/>
+              <w:bottom w:w="80" w:type="dxa"/>
+              <w:end w:w="120" w:type="dxa"/>
+            </w:tcMar>
+          </w:tcPr>
+          <w:p>
+            <w:pPr>
+              <w:spacing w:after="0"/>
+              <w:jc w:val="right"/>
+            </w:pPr>
+            <w:r>
+              <w:rPr>
+                <w:rFonts w:ascii="Calibri" w:hAnsi="Calibri"/>
+                <w:color w:val="20384A"/>
+                <w:sz w:val="18"/>
+              </w:rPr>
+              <w:t>$123.5M</w:t>
+            </w:r>
+          </w:p>
+        </w:tc>
+        <w:tc>
+          <w:tcPr>
+            <w:tcW w:type="dxa" w:w="2200"/>
+            <w:vAlign w:val="center"/>
+            <w:tcMar>
+              <w:top w:w="80" w:type="dxa"/>
+              <w:start w:w="120" w:type="dxa"/>
+              <w:bottom w:w="80" w:type="dxa"/>
+              <w:end w:w="120" w:type="dxa"/>
+            </w:tcMar>
+          </w:tcPr>
+          <w:p>
+            <w:pPr>
+              <w:spacing w:after="0"/>
+              <w:jc w:val="right"/>
+            </w:pPr>
+            <w:r>
+              <w:rPr>
+                <w:rFonts w:ascii="Calibri" w:hAnsi="Calibri"/>
+                <w:color w:val="20384A"/>
+                <w:sz w:val="18"/>
+              </w:rPr>
+              <w:t>$26.9M</w:t>
+            </w:r>
+          </w:p>
+        </w:tc>
+        <w:tc>
+          <w:tcPr>
+            <w:tcW w:type="dxa" w:w="1800"/>
+            <w:vAlign w:val="center"/>
+            <w:tcMar>
+              <w:top w:w="80" w:type="dxa"/>
+              <w:start w:w="120" w:type="dxa"/>
+              <w:bottom w:w="80" w:type="dxa"/>
+              <w:end w:w="120" w:type="dxa"/>
+            </w:tcMar>
+          </w:tcPr>
+          <w:p>
+            <w:pPr>
+              <w:spacing w:after="0"/>
+              <w:jc w:val="right"/>
+            </w:pPr>
+            <w:r>
+              <w:rPr>
+                <w:rFonts w:ascii="Calibri" w:hAnsi="Calibri"/>
+                <w:color w:val="20384A"/>
+                <w:sz w:val="18"/>
+              </w:rPr>
+              <w:t>21.76%</w:t>
+            </w:r>
+          </w:p>
+        </w:tc>
+        <w:tc>
+          <w:tcPr>
+            <w:tcW w:type="dxa" w:w="2260"/>
+            <w:vAlign w:val="center"/>
+            <w:tcMar>
+              <w:top w:w="80" w:type="dxa"/>
+              <w:start w:w="120" w:type="dxa"/>
+              <w:bottom w:w="80" w:type="dxa"/>
+              <w:end w:w="120" w:type="dxa"/>
+            </w:tcMar>
+          </w:tcPr>
+          <w:p>
+            <w:pPr>
+              <w:spacing w:after="0"/>
+              <w:jc w:val="right"/>
+            </w:pPr>
+            <w:r>
+              <w:rPr>
+                <w:rFonts w:ascii="Calibri" w:hAnsi="Calibri"/>
+                <w:color w:val="20384A"/>
+                <w:sz w:val="18"/>
+              </w:rPr>
+              <w:t>6.15%</w:t>
+            </w:r>
+          </w:p>
+        </w:tc>
+      </w:tr>
+      <w:tr>
+        <w:tc>
+          <w:tcPr>
+            <w:tcW w:type="dxa" w:w="900"/>
+            <w:vAlign w:val="center"/>
+            <w:tcMar>
+              <w:top w:w="80" w:type="dxa"/>
+              <w:start w:w="120" w:type="dxa"/>
+              <w:bottom w:w="80" w:type="dxa"/>
+              <w:end w:w="120" w:type="dxa"/>
+            </w:tcMar>
+          </w:tcPr>
+          <w:p>
+            <w:pPr>
+              <w:spacing w:after="0"/>
+              <w:jc w:val="center"/>
+            </w:pPr>
+            <w:r>
+              <w:rPr>
+                <w:rFonts w:ascii="Calibri" w:hAnsi="Calibri"/>
+                <w:color w:val="20384A"/>
+                <w:sz w:val="18"/>
+              </w:rPr>
+              <w:t>2024</w:t>
+            </w:r>
+          </w:p>
+        </w:tc>
+        <w:tc>
+          <w:tcPr>
+            <w:tcW w:type="dxa" w:w="2200"/>
+            <w:vAlign w:val="center"/>
+            <w:tcMar>
+              <w:top w:w="80" w:type="dxa"/>
+              <w:start w:w="120" w:type="dxa"/>
+              <w:bottom w:w="80" w:type="dxa"/>
+              <w:end w:w="120" w:type="dxa"/>
+            </w:tcMar>
+          </w:tcPr>
+          <w:p>
+            <w:pPr>
+              <w:spacing w:after="0"/>
+              <w:jc w:val="right"/>
+            </w:pPr>
+            <w:r>
+              <w:rPr>
+                <w:rFonts w:ascii="Calibri" w:hAnsi="Calibri"/>
+                <w:color w:val="20384A"/>
+                <w:sz w:val="18"/>
+              </w:rPr>
+              <w:t>$131.0M</w:t>
+            </w:r>
+          </w:p>
+        </w:tc>
+        <w:tc>
+          <w:tcPr>
+            <w:tcW w:type="dxa" w:w="2200"/>
+            <w:vAlign w:val="center"/>
+            <w:tcMar>
+              <w:top w:w="80" w:type="dxa"/>
+              <w:start w:w="120" w:type="dxa"/>
+              <w:bottom w:w="80" w:type="dxa"/>
+              <w:end w:w="120" w:type="dxa"/>
+            </w:tcMar>
+          </w:tcPr>
+          <w:p>
+            <w:pPr>
+              <w:spacing w:after="0"/>
+              <w:jc w:val="right"/>
+            </w:pPr>
+            <w:r>
+              <w:rPr>
+                <w:rFonts w:ascii="Calibri" w:hAnsi="Calibri"/>
+                <w:color w:val="20384A"/>
+                <w:sz w:val="18"/>
+              </w:rPr>
+              <w:t>$28.8M</w:t>
+            </w:r>
+          </w:p>
+        </w:tc>
+        <w:tc>
+          <w:tcPr>
+            <w:tcW w:type="dxa" w:w="1800"/>
+            <w:vAlign w:val="center"/>
+            <w:tcMar>
+              <w:top w:w="80" w:type="dxa"/>
+              <w:start w:w="120" w:type="dxa"/>
+              <w:bottom w:w="80" w:type="dxa"/>
+              <w:end w:w="120" w:type="dxa"/>
+            </w:tcMar>
+          </w:tcPr>
+          <w:p>
+            <w:pPr>
+              <w:spacing w:after="0"/>
+              <w:jc w:val="right"/>
+            </w:pPr>
+            <w:r>
+              <w:rPr>
+                <w:rFonts w:ascii="Calibri" w:hAnsi="Calibri"/>
+                <w:color w:val="20384A"/>
+                <w:sz w:val="18"/>
+              </w:rPr>
+              <w:t>22.01%</w:t>
+            </w:r>
+          </w:p>
+        </w:tc>
+        <w:tc>
+          <w:tcPr>
+            <w:tcW w:type="dxa" w:w="2260"/>
+            <w:vAlign w:val="center"/>
+            <w:tcMar>
+              <w:top w:w="80" w:type="dxa"/>
+              <w:start w:w="120" w:type="dxa"/>
+              <w:bottom w:w="80" w:type="dxa"/>
+              <w:end w:w="120" w:type="dxa"/>
+            </w:tcMar>
+          </w:tcPr>
+          <w:p>
+            <w:pPr>
+              <w:spacing w:after="0"/>
+              <w:jc w:val="right"/>
+            </w:pPr>
+            <w:r>
+              <w:rPr>
+                <w:rFonts w:ascii="Calibri" w:hAnsi="Calibri"/>
+                <w:color w:val="20384A"/>
+                <w:sz w:val="18"/>
+              </w:rPr>
+              <w:t>6.05%</w:t>
+            </w:r>
+          </w:p>
+        </w:tc>
+      </w:tr>
+    </w:tbl>
+    <w:p>
+      <w:pPr>
+        <w:keepLines/>
+      </w:pPr>
+      <w:r>
+        <w:rPr>
+          <w:rFonts w:ascii="Calibri" w:hAnsi="Calibri"/>
+          <w:color w:val="20384A"/>
+          <w:sz w:val="22"/>
+        </w:rPr>
+        <w:t>Revenue increased 65.0% from 2018 to 2024, while gross profit increased 89.6%. Gross margin finished 2.86 percentage points higher. Growth slowed to about 6% in 2023 and 2024, but gross profit still grew faster than revenue. The historical pattern remains healthy through 2024, although it is not a forecast.</w:t>
       </w:r>
     </w:p>
     <w:p>
@@ -5017,7 +5017,7 @@
         <w:keepNext/>
       </w:pPr>
       <w:r>
-        <w:t>1. Protect the core while diversifying the growth pipeline</w:t>
+        <w:t>1. Protect Independent Retail while building other sources of growth</w:t>
       </w:r>
     </w:p>
     <w:p>
@@ -5030,7 +5030,7 @@
           <w:color w:val="20384A"/>
           <w:sz w:val="22"/>
         </w:rPr>
-        <w:t>Create an Independent Retail operating review covering revenue, margin, active customers, retention status, service, and company revenue share. In parallel, test repeatable acquisition plays in high-margin segments such as Retail Cooperative Network and Independent Distribution Partner.</w:t>
+        <w:t>Review Independent Retail revenue, margin, active customers, retention, and service levels every month. At the same time, test focused growth efforts in smaller high-margin segments such as Retail Cooperative Network and Independent Distribution Partner.</w:t>
       </w:r>
     </w:p>
     <w:p>
@@ -5052,7 +5052,7 @@
           <w:color w:val="20384A"/>
           <w:sz w:val="22"/>
         </w:rPr>
-        <w:t xml:space="preserve"> Core-segment retention and margin; new revenue and gross profit from targeted expansion segments.</w:t>
+        <w:t xml:space="preserve"> Independent Retail retention and margin; new revenue and gross profit from the selected growth segments.</w:t>
       </w:r>
     </w:p>
     <w:p>
@@ -5061,7 +5061,7 @@
         <w:keepNext/>
       </w:pPr>
       <w:r>
-        <w:t>2. Build a value-based retention queue</w:t>
+        <w:t>2. Use a prioritized customer outreach list</w:t>
       </w:r>
     </w:p>
     <w:p>
@@ -5074,7 +5074,7 @@
           <w:color w:val="20384A"/>
           <w:sz w:val="22"/>
         </w:rPr>
-        <w:t>Run the lifecycle logic monthly. Prioritize the highest-baseline 7-12 month accounts for human outreach, use low-cost interventions for 4-6 month accounts, and test reactivation only on the most valuable dormant accounts.</w:t>
+        <w:t>Run the lifecycle analysis monthly. Contact high-value customers inactive for 7-12 months first, use lower-cost reminders for 4-6 month accounts, and test reactivation only on the most valuable dormant accounts.</w:t>
       </w:r>
     </w:p>
     <w:p>
@@ -5105,7 +5105,7 @@
         <w:keepNext/>
       </w:pPr>
       <w:r>
-        <w:t>3. Improve margin in large, margin-light segments</w:t>
+        <w:t>3. Improve margins in large segments that lag the company average</w:t>
       </w:r>
     </w:p>
     <w:p>
@@ -5118,7 +5118,7 @@
           <w:color w:val="20384A"/>
           <w:sz w:val="22"/>
         </w:rPr>
-        <w:t>Start with Wholesale Trade and other material segments whose gross-profit share trails their revenue share. Diagnose price realization, discounting, product mix, purchasing, freight recovery, and service intensity before setting blanket growth targets.</w:t>
+        <w:t>Start with Wholesale Trade and other large segments whose share of gross profit is lower than their share of revenue. Review pricing, discounts, product mix, purchasing, freight recovery, returns, and service requirements before setting new growth targets.</w:t>
       </w:r>
     </w:p>
     <w:p>
@@ -5281,7 +5281,7 @@
                 <w:color w:val="20384A"/>
                 <w:sz w:val="18"/>
               </w:rPr>
-              <w:t>Growth</w:t>
+              <w:t>Segments</w:t>
             </w:r>
           </w:p>
         </w:tc>
@@ -5306,7 +5306,7 @@
                 <w:color w:val="20384A"/>
                 <w:sz w:val="18"/>
               </w:rPr>
-              <w:t>Recognized revenue growth</w:t>
+              <w:t>Revenue, gross profit, and margin</w:t>
             </w:r>
           </w:p>
         </w:tc>
@@ -5331,84 +5331,7 @@
                 <w:color w:val="20384A"/>
                 <w:sz w:val="18"/>
               </w:rPr>
-              <w:t>Growth slowing without margin support</w:t>
-            </w:r>
-          </w:p>
-        </w:tc>
-      </w:tr>
-      <w:tr>
-        <w:tc>
-          <w:tcPr>
-            <w:tcW w:type="dxa" w:w="2100"/>
-            <w:vAlign w:val="center"/>
-            <w:tcMar>
-              <w:top w:w="80" w:type="dxa"/>
-              <w:start w:w="120" w:type="dxa"/>
-              <w:bottom w:w="80" w:type="dxa"/>
-              <w:end w:w="120" w:type="dxa"/>
-            </w:tcMar>
-          </w:tcPr>
-          <w:p>
-            <w:pPr>
-              <w:spacing w:after="0"/>
-            </w:pPr>
-            <w:r>
-              <w:rPr>
-                <w:rFonts w:ascii="Calibri" w:hAnsi="Calibri"/>
-                <w:color w:val="20384A"/>
-                <w:sz w:val="18"/>
-              </w:rPr>
-              <w:t>Profitability</w:t>
-            </w:r>
-          </w:p>
-        </w:tc>
-        <w:tc>
-          <w:tcPr>
-            <w:tcW w:type="dxa" w:w="3100"/>
-            <w:vAlign w:val="center"/>
-            <w:tcMar>
-              <w:top w:w="80" w:type="dxa"/>
-              <w:start w:w="120" w:type="dxa"/>
-              <w:bottom w:w="80" w:type="dxa"/>
-              <w:end w:w="120" w:type="dxa"/>
-            </w:tcMar>
-          </w:tcPr>
-          <w:p>
-            <w:pPr>
-              <w:spacing w:after="0"/>
-            </w:pPr>
-            <w:r>
-              <w:rPr>
-                <w:rFonts w:ascii="Calibri" w:hAnsi="Calibri"/>
-                <w:color w:val="20384A"/>
-                <w:sz w:val="18"/>
-              </w:rPr>
-              <w:t>Gross-profit growth and margin</w:t>
-            </w:r>
-          </w:p>
-        </w:tc>
-        <w:tc>
-          <w:tcPr>
-            <w:tcW w:type="dxa" w:w="4160"/>
-            <w:vAlign w:val="center"/>
-            <w:tcMar>
-              <w:top w:w="80" w:type="dxa"/>
-              <w:start w:w="120" w:type="dxa"/>
-              <w:bottom w:w="80" w:type="dxa"/>
-              <w:end w:w="120" w:type="dxa"/>
-            </w:tcMar>
-          </w:tcPr>
-          <w:p>
-            <w:pPr>
-              <w:spacing w:after="0"/>
-            </w:pPr>
-            <w:r>
-              <w:rPr>
-                <w:rFonts w:ascii="Calibri" w:hAnsi="Calibri"/>
-                <w:color w:val="20384A"/>
-                <w:sz w:val="18"/>
-              </w:rPr>
-              <w:t>Revenue-heavy, profit-light segment</w:t>
+              <w:t>A large segment contributes less profit than expected</w:t>
             </w:r>
           </w:p>
         </w:tc>
@@ -5460,7 +5383,7 @@
                 <w:color w:val="20384A"/>
                 <w:sz w:val="18"/>
               </w:rPr>
-              <w:t>Largest-segment share</w:t>
+              <w:t>Largest-segment and top-customer shares</w:t>
             </w:r>
           </w:p>
         </w:tc>
@@ -5485,7 +5408,7 @@
                 <w:color w:val="20384A"/>
                 <w:sz w:val="18"/>
               </w:rPr>
-              <w:t>Segment share rising faster than diversification</w:t>
+              <w:t>Segment dependence continues to rise</w:t>
             </w:r>
           </w:p>
         </w:tc>
@@ -5537,7 +5460,7 @@
                 <w:color w:val="20384A"/>
                 <w:sz w:val="18"/>
               </w:rPr>
-              <w:t>Trailing revenue baseline at risk</w:t>
+              <w:t>Historical revenue tied to non-active customers</w:t>
             </w:r>
           </w:p>
         </w:tc>
@@ -5562,7 +5485,84 @@
                 <w:color w:val="20384A"/>
                 <w:sz w:val="18"/>
               </w:rPr>
-              <w:t>Watch and at-risk pool expanding</w:t>
+              <w:t>Recent watch and at-risk groups are growing</w:t>
+            </w:r>
+          </w:p>
+        </w:tc>
+      </w:tr>
+      <w:tr>
+        <w:tc>
+          <w:tcPr>
+            <w:tcW w:type="dxa" w:w="2100"/>
+            <w:vAlign w:val="center"/>
+            <w:tcMar>
+              <w:top w:w="80" w:type="dxa"/>
+              <w:start w:w="120" w:type="dxa"/>
+              <w:bottom w:w="80" w:type="dxa"/>
+              <w:end w:w="120" w:type="dxa"/>
+            </w:tcMar>
+          </w:tcPr>
+          <w:p>
+            <w:pPr>
+              <w:spacing w:after="0"/>
+            </w:pPr>
+            <w:r>
+              <w:rPr>
+                <w:rFonts w:ascii="Calibri" w:hAnsi="Calibri"/>
+                <w:color w:val="20384A"/>
+                <w:sz w:val="18"/>
+              </w:rPr>
+              <w:t>Financial trend</w:t>
+            </w:r>
+          </w:p>
+        </w:tc>
+        <w:tc>
+          <w:tcPr>
+            <w:tcW w:type="dxa" w:w="3100"/>
+            <w:vAlign w:val="center"/>
+            <w:tcMar>
+              <w:top w:w="80" w:type="dxa"/>
+              <w:start w:w="120" w:type="dxa"/>
+              <w:bottom w:w="80" w:type="dxa"/>
+              <w:end w:w="120" w:type="dxa"/>
+            </w:tcMar>
+          </w:tcPr>
+          <w:p>
+            <w:pPr>
+              <w:spacing w:after="0"/>
+            </w:pPr>
+            <w:r>
+              <w:rPr>
+                <w:rFonts w:ascii="Calibri" w:hAnsi="Calibri"/>
+                <w:color w:val="20384A"/>
+                <w:sz w:val="18"/>
+              </w:rPr>
+              <w:t>Revenue growth, GP growth, and margin</w:t>
+            </w:r>
+          </w:p>
+        </w:tc>
+        <w:tc>
+          <w:tcPr>
+            <w:tcW w:type="dxa" w:w="4160"/>
+            <w:vAlign w:val="center"/>
+            <w:tcMar>
+              <w:top w:w="80" w:type="dxa"/>
+              <w:start w:w="120" w:type="dxa"/>
+              <w:bottom w:w="80" w:type="dxa"/>
+              <w:end w:w="120" w:type="dxa"/>
+            </w:tcMar>
+          </w:tcPr>
+          <w:p>
+            <w:pPr>
+              <w:spacing w:after="0"/>
+            </w:pPr>
+            <w:r>
+              <w:rPr>
+                <w:rFonts w:ascii="Calibri" w:hAnsi="Calibri"/>
+                <w:color w:val="20384A"/>
+                <w:sz w:val="18"/>
+              </w:rPr>
+              <w:t>Revenue slows while profit or margin also weakens</w:t>
             </w:r>
           </w:p>
         </w:tc>
@@ -5639,7 +5639,7 @@
                 <w:color w:val="20384A"/>
                 <w:sz w:val="18"/>
               </w:rPr>
-              <w:t>Peak-quarter service or cash strain</w:t>
+              <w:t>The company is underprepared for busy months</w:t>
             </w:r>
           </w:p>
         </w:tc>
@@ -6156,7 +6156,7 @@
           <w:color w:val="17365D"/>
           <w:sz w:val="22"/>
         </w:rPr>
-        <w:t>Conclusion: The company’s growth history is economically healthy. The highest-value next step is to manage revenue quality explicitly—protecting the profitable core, improving scale economics, and focusing retention effort on the accounts most worth recovering.</w:t>
+        <w:t>Conclusion: The company has grown while improving gross profit and margin. Its clearest next steps are to protect Independent Retail, improve weaker margins in other large segments, and focus retention work on recently valuable inactive customers.</w:t>
       </w:r>
     </w:p>
     <w:sectPr>

</xml_diff>